<commit_message>
Add Document Buoi06 !
</commit_message>
<xml_diff>
--- a/236115_NguyenNhatHao_B6.docx
+++ b/236115_NguyenNhatHao_B6.docx
@@ -124,6 +124,57 @@
           <w:sz w:val="28"/>
           <w:szCs w:val="28"/>
         </w:rPr>
+        <w:drawing>
+          <wp:inline distT="0" distB="0" distL="0" distR="0" wp14:anchorId="313BBA09" wp14:editId="7AF3AF6A">
+            <wp:extent cx="5760720" cy="603885"/>
+            <wp:effectExtent l="0" t="0" r="0" b="5715"/>
+            <wp:docPr id="939303690" name="Picture 1"/>
+            <wp:cNvGraphicFramePr>
+              <a:graphicFrameLocks xmlns:a="http://schemas.openxmlformats.org/drawingml/2006/main" noChangeAspect="1"/>
+            </wp:cNvGraphicFramePr>
+            <a:graphic xmlns:a="http://schemas.openxmlformats.org/drawingml/2006/main">
+              <a:graphicData uri="http://schemas.openxmlformats.org/drawingml/2006/picture">
+                <pic:pic xmlns:pic="http://schemas.openxmlformats.org/drawingml/2006/picture">
+                  <pic:nvPicPr>
+                    <pic:cNvPr id="939303690" name=""/>
+                    <pic:cNvPicPr/>
+                  </pic:nvPicPr>
+                  <pic:blipFill>
+                    <a:blip r:embed="rId5"/>
+                    <a:stretch>
+                      <a:fillRect/>
+                    </a:stretch>
+                  </pic:blipFill>
+                  <pic:spPr>
+                    <a:xfrm>
+                      <a:off x="0" y="0"/>
+                      <a:ext cx="5760720" cy="603885"/>
+                    </a:xfrm>
+                    <a:prstGeom prst="rect">
+                      <a:avLst/>
+                    </a:prstGeom>
+                  </pic:spPr>
+                </pic:pic>
+              </a:graphicData>
+            </a:graphic>
+          </wp:inline>
+        </w:drawing>
+      </w:r>
+    </w:p>
+    <w:p>
+      <w:pPr>
+        <w:rPr>
+          <w:rFonts w:ascii="Times New Roman" w:hAnsi="Times New Roman" w:cs="Times New Roman"/>
+          <w:sz w:val="28"/>
+          <w:szCs w:val="28"/>
+        </w:rPr>
+      </w:pPr>
+      <w:r>
+        <w:rPr>
+          <w:rFonts w:ascii="Times New Roman" w:hAnsi="Times New Roman" w:cs="Times New Roman"/>
+          <w:sz w:val="28"/>
+          <w:szCs w:val="28"/>
+        </w:rPr>
         <w:t>Câu 65. Kiểm tra Port của Backend và Frontend Container. (Gợi ý lệnh: docker</w:t>
       </w:r>
       <w:r>
@@ -158,15 +209,147 @@
           <w:sz w:val="28"/>
           <w:szCs w:val="28"/>
         </w:rPr>
+        <w:drawing>
+          <wp:inline distT="0" distB="0" distL="0" distR="0" wp14:anchorId="458FA534" wp14:editId="7B6CD612">
+            <wp:extent cx="5760720" cy="384810"/>
+            <wp:effectExtent l="0" t="0" r="0" b="0"/>
+            <wp:docPr id="302764405" name="Picture 1"/>
+            <wp:cNvGraphicFramePr>
+              <a:graphicFrameLocks xmlns:a="http://schemas.openxmlformats.org/drawingml/2006/main" noChangeAspect="1"/>
+            </wp:cNvGraphicFramePr>
+            <a:graphic xmlns:a="http://schemas.openxmlformats.org/drawingml/2006/main">
+              <a:graphicData uri="http://schemas.openxmlformats.org/drawingml/2006/picture">
+                <pic:pic xmlns:pic="http://schemas.openxmlformats.org/drawingml/2006/picture">
+                  <pic:nvPicPr>
+                    <pic:cNvPr id="302764405" name=""/>
+                    <pic:cNvPicPr/>
+                  </pic:nvPicPr>
+                  <pic:blipFill>
+                    <a:blip r:embed="rId6"/>
+                    <a:stretch>
+                      <a:fillRect/>
+                    </a:stretch>
+                  </pic:blipFill>
+                  <pic:spPr>
+                    <a:xfrm>
+                      <a:off x="0" y="0"/>
+                      <a:ext cx="5760720" cy="384810"/>
+                    </a:xfrm>
+                    <a:prstGeom prst="rect">
+                      <a:avLst/>
+                    </a:prstGeom>
+                  </pic:spPr>
+                </pic:pic>
+              </a:graphicData>
+            </a:graphic>
+          </wp:inline>
+        </w:drawing>
+      </w:r>
+    </w:p>
+    <w:p>
+      <w:pPr>
+        <w:rPr>
+          <w:rFonts w:ascii="Times New Roman" w:hAnsi="Times New Roman" w:cs="Times New Roman"/>
+          <w:sz w:val="28"/>
+          <w:szCs w:val="28"/>
+        </w:rPr>
+      </w:pPr>
+      <w:r>
+        <w:rPr>
+          <w:rFonts w:ascii="Times New Roman" w:hAnsi="Times New Roman" w:cs="Times New Roman"/>
+          <w:sz w:val="28"/>
+          <w:szCs w:val="28"/>
+        </w:rPr>
+        <w:t xml:space="preserve">&gt;&gt;&gt; </w:t>
+      </w:r>
+      <w:r>
+        <w:rPr>
+          <w:rFonts w:ascii="Times New Roman" w:hAnsi="Times New Roman" w:cs="Times New Roman"/>
+          <w:sz w:val="28"/>
+          <w:szCs w:val="28"/>
+        </w:rPr>
+        <w:t>Kết quả: mern-backend-container PORTS: 0.0.0.0:5000-&gt;5000/tcp =&gt; Backend Container đang sử dụng cổng 5000. Hiện chưa có Frontend Container đang chạy nên chưa có thông tin port của Frontend.</w:t>
+      </w:r>
+    </w:p>
+    <w:p>
+      <w:pPr>
+        <w:rPr>
+          <w:rFonts w:ascii="Times New Roman" w:hAnsi="Times New Roman" w:cs="Times New Roman"/>
+          <w:sz w:val="28"/>
+          <w:szCs w:val="28"/>
+          <w:lang w:val="vi-VN"/>
+        </w:rPr>
+      </w:pPr>
+      <w:r>
+        <w:rPr>
+          <w:rFonts w:ascii="Times New Roman" w:hAnsi="Times New Roman" w:cs="Times New Roman"/>
+          <w:sz w:val="28"/>
+          <w:szCs w:val="28"/>
+        </w:rPr>
         <w:t xml:space="preserve">Câu 66. Kiểm tra Endpoint Backend đang được sử dụng trong React Frontend. (Gợi ý: Tìm URL API trong source code React.) </w:t>
       </w:r>
     </w:p>
     <w:p>
       <w:pPr>
-        <w:rPr>
-          <w:rFonts w:ascii="Times New Roman" w:hAnsi="Times New Roman" w:cs="Times New Roman"/>
-          <w:sz w:val="28"/>
-          <w:szCs w:val="28"/>
+        <w:jc w:val="center"/>
+        <w:rPr>
+          <w:rFonts w:ascii="Times New Roman" w:hAnsi="Times New Roman" w:cs="Times New Roman"/>
+          <w:sz w:val="28"/>
+          <w:szCs w:val="28"/>
+          <w:lang w:val="vi-VN"/>
+        </w:rPr>
+      </w:pPr>
+      <w:r>
+        <w:rPr>
+          <w:rFonts w:ascii="Times New Roman" w:hAnsi="Times New Roman" w:cs="Times New Roman"/>
+          <w:sz w:val="28"/>
+          <w:szCs w:val="28"/>
+          <w:lang w:val="vi-VN"/>
+        </w:rPr>
+        <w:drawing>
+          <wp:inline distT="0" distB="0" distL="0" distR="0" wp14:anchorId="20848018" wp14:editId="1632EC91">
+            <wp:extent cx="3635055" cy="1188823"/>
+            <wp:effectExtent l="0" t="0" r="3810" b="0"/>
+            <wp:docPr id="1663431092" name="Picture 1"/>
+            <wp:cNvGraphicFramePr>
+              <a:graphicFrameLocks xmlns:a="http://schemas.openxmlformats.org/drawingml/2006/main" noChangeAspect="1"/>
+            </wp:cNvGraphicFramePr>
+            <a:graphic xmlns:a="http://schemas.openxmlformats.org/drawingml/2006/main">
+              <a:graphicData uri="http://schemas.openxmlformats.org/drawingml/2006/picture">
+                <pic:pic xmlns:pic="http://schemas.openxmlformats.org/drawingml/2006/picture">
+                  <pic:nvPicPr>
+                    <pic:cNvPr id="1663431092" name=""/>
+                    <pic:cNvPicPr/>
+                  </pic:nvPicPr>
+                  <pic:blipFill>
+                    <a:blip r:embed="rId7"/>
+                    <a:stretch>
+                      <a:fillRect/>
+                    </a:stretch>
+                  </pic:blipFill>
+                  <pic:spPr>
+                    <a:xfrm>
+                      <a:off x="0" y="0"/>
+                      <a:ext cx="3635055" cy="1188823"/>
+                    </a:xfrm>
+                    <a:prstGeom prst="rect">
+                      <a:avLst/>
+                    </a:prstGeom>
+                  </pic:spPr>
+                </pic:pic>
+              </a:graphicData>
+            </a:graphic>
+          </wp:inline>
+        </w:drawing>
+      </w:r>
+    </w:p>
+    <w:p>
+      <w:pPr>
+        <w:rPr>
+          <w:rFonts w:ascii="Times New Roman" w:hAnsi="Times New Roman" w:cs="Times New Roman"/>
+          <w:sz w:val="28"/>
+          <w:szCs w:val="28"/>
+          <w:lang w:val="vi-VN"/>
         </w:rPr>
       </w:pPr>
       <w:r>
@@ -180,27 +363,100 @@
     </w:p>
     <w:p>
       <w:pPr>
-        <w:rPr>
-          <w:rFonts w:ascii="Times New Roman" w:hAnsi="Times New Roman" w:cs="Times New Roman"/>
-          <w:sz w:val="28"/>
-          <w:szCs w:val="28"/>
-        </w:rPr>
-      </w:pPr>
-      <w:r>
-        <w:rPr>
-          <w:rFonts w:ascii="Times New Roman" w:hAnsi="Times New Roman" w:cs="Times New Roman"/>
-          <w:sz w:val="28"/>
-          <w:szCs w:val="28"/>
-        </w:rPr>
-        <w:t xml:space="preserve">Câu 68. Kiểm tra Docker Network vừa tạo. (Gợi ý lệnh: docker network ls) </w:t>
-      </w:r>
-    </w:p>
-    <w:p>
-      <w:pPr>
-        <w:rPr>
-          <w:rFonts w:ascii="Times New Roman" w:hAnsi="Times New Roman" w:cs="Times New Roman"/>
-          <w:sz w:val="28"/>
-          <w:szCs w:val="28"/>
+        <w:jc w:val="center"/>
+        <w:rPr>
+          <w:rFonts w:ascii="Times New Roman" w:hAnsi="Times New Roman" w:cs="Times New Roman"/>
+          <w:sz w:val="28"/>
+          <w:szCs w:val="28"/>
+          <w:lang w:val="vi-VN"/>
+        </w:rPr>
+      </w:pPr>
+      <w:r>
+        <w:rPr>
+          <w:rFonts w:ascii="Times New Roman" w:hAnsi="Times New Roman" w:cs="Times New Roman"/>
+          <w:sz w:val="28"/>
+          <w:szCs w:val="28"/>
+          <w:lang w:val="vi-VN"/>
+        </w:rPr>
+        <w:drawing>
+          <wp:inline distT="0" distB="0" distL="0" distR="0" wp14:anchorId="59BC3F26" wp14:editId="25CF69A0">
+            <wp:extent cx="4587638" cy="548688"/>
+            <wp:effectExtent l="0" t="0" r="3810" b="3810"/>
+            <wp:docPr id="1981642585" name="Picture 1"/>
+            <wp:cNvGraphicFramePr>
+              <a:graphicFrameLocks xmlns:a="http://schemas.openxmlformats.org/drawingml/2006/main" noChangeAspect="1"/>
+            </wp:cNvGraphicFramePr>
+            <a:graphic xmlns:a="http://schemas.openxmlformats.org/drawingml/2006/main">
+              <a:graphicData uri="http://schemas.openxmlformats.org/drawingml/2006/picture">
+                <pic:pic xmlns:pic="http://schemas.openxmlformats.org/drawingml/2006/picture">
+                  <pic:nvPicPr>
+                    <pic:cNvPr id="1981642585" name=""/>
+                    <pic:cNvPicPr/>
+                  </pic:nvPicPr>
+                  <pic:blipFill>
+                    <a:blip r:embed="rId8"/>
+                    <a:stretch>
+                      <a:fillRect/>
+                    </a:stretch>
+                  </pic:blipFill>
+                  <pic:spPr>
+                    <a:xfrm>
+                      <a:off x="0" y="0"/>
+                      <a:ext cx="4587638" cy="548688"/>
+                    </a:xfrm>
+                    <a:prstGeom prst="rect">
+                      <a:avLst/>
+                    </a:prstGeom>
+                  </pic:spPr>
+                </pic:pic>
+              </a:graphicData>
+            </a:graphic>
+          </wp:inline>
+        </w:drawing>
+      </w:r>
+    </w:p>
+    <w:p>
+      <w:pPr>
+        <w:rPr>
+          <w:rFonts w:ascii="Times New Roman" w:hAnsi="Times New Roman" w:cs="Times New Roman"/>
+          <w:sz w:val="28"/>
+          <w:szCs w:val="28"/>
+          <w:lang w:val="vi-VN"/>
+        </w:rPr>
+      </w:pPr>
+      <w:r>
+        <w:rPr>
+          <w:rFonts w:ascii="Times New Roman" w:hAnsi="Times New Roman" w:cs="Times New Roman"/>
+          <w:sz w:val="28"/>
+          <w:szCs w:val="28"/>
+        </w:rPr>
+        <w:t>Câu 68. Kiểm tra Docker Network vừa tạo. (Gợi ý lệnh: docker network ls)</w:t>
+      </w:r>
+    </w:p>
+    <w:p>
+      <w:pPr>
+        <w:rPr>
+          <w:rFonts w:ascii="Times New Roman" w:hAnsi="Times New Roman" w:cs="Times New Roman"/>
+          <w:sz w:val="28"/>
+          <w:szCs w:val="28"/>
+        </w:rPr>
+      </w:pPr>
+      <w:r>
+        <w:rPr>
+          <w:rFonts w:ascii="Times New Roman" w:hAnsi="Times New Roman" w:cs="Times New Roman"/>
+          <w:sz w:val="28"/>
+          <w:szCs w:val="28"/>
+        </w:rPr>
+        <w:t xml:space="preserve"> </w:t>
+      </w:r>
+    </w:p>
+    <w:p>
+      <w:pPr>
+        <w:rPr>
+          <w:rFonts w:ascii="Times New Roman" w:hAnsi="Times New Roman" w:cs="Times New Roman"/>
+          <w:sz w:val="28"/>
+          <w:szCs w:val="28"/>
+          <w:lang w:val="vi-VN"/>
         </w:rPr>
       </w:pPr>
       <w:r>
@@ -214,10 +470,66 @@
     </w:p>
     <w:p>
       <w:pPr>
-        <w:rPr>
-          <w:rFonts w:ascii="Times New Roman" w:hAnsi="Times New Roman" w:cs="Times New Roman"/>
-          <w:sz w:val="28"/>
-          <w:szCs w:val="28"/>
+        <w:jc w:val="center"/>
+        <w:rPr>
+          <w:rFonts w:ascii="Times New Roman" w:hAnsi="Times New Roman" w:cs="Times New Roman"/>
+          <w:sz w:val="28"/>
+          <w:szCs w:val="28"/>
+          <w:lang w:val="vi-VN"/>
+        </w:rPr>
+      </w:pPr>
+      <w:r>
+        <w:rPr>
+          <w:rFonts w:ascii="Times New Roman" w:hAnsi="Times New Roman" w:cs="Times New Roman"/>
+          <w:sz w:val="28"/>
+          <w:szCs w:val="28"/>
+          <w:lang w:val="vi-VN"/>
+        </w:rPr>
+        <w:lastRenderedPageBreak/>
+        <w:drawing>
+          <wp:inline distT="0" distB="0" distL="0" distR="0" wp14:anchorId="61442F33" wp14:editId="0FD3A18E">
+            <wp:extent cx="3627434" cy="1348857"/>
+            <wp:effectExtent l="0" t="0" r="0" b="3810"/>
+            <wp:docPr id="1511017747" name="Picture 1"/>
+            <wp:cNvGraphicFramePr>
+              <a:graphicFrameLocks xmlns:a="http://schemas.openxmlformats.org/drawingml/2006/main" noChangeAspect="1"/>
+            </wp:cNvGraphicFramePr>
+            <a:graphic xmlns:a="http://schemas.openxmlformats.org/drawingml/2006/main">
+              <a:graphicData uri="http://schemas.openxmlformats.org/drawingml/2006/picture">
+                <pic:pic xmlns:pic="http://schemas.openxmlformats.org/drawingml/2006/picture">
+                  <pic:nvPicPr>
+                    <pic:cNvPr id="1511017747" name=""/>
+                    <pic:cNvPicPr/>
+                  </pic:nvPicPr>
+                  <pic:blipFill>
+                    <a:blip r:embed="rId9"/>
+                    <a:stretch>
+                      <a:fillRect/>
+                    </a:stretch>
+                  </pic:blipFill>
+                  <pic:spPr>
+                    <a:xfrm>
+                      <a:off x="0" y="0"/>
+                      <a:ext cx="3627434" cy="1348857"/>
+                    </a:xfrm>
+                    <a:prstGeom prst="rect">
+                      <a:avLst/>
+                    </a:prstGeom>
+                  </pic:spPr>
+                </pic:pic>
+              </a:graphicData>
+            </a:graphic>
+          </wp:inline>
+        </w:drawing>
+      </w:r>
+    </w:p>
+    <w:p>
+      <w:pPr>
+        <w:rPr>
+          <w:rFonts w:ascii="Times New Roman" w:hAnsi="Times New Roman" w:cs="Times New Roman"/>
+          <w:sz w:val="28"/>
+          <w:szCs w:val="28"/>
+          <w:lang w:val="vi-VN"/>
         </w:rPr>
       </w:pPr>
       <w:r>
@@ -235,6 +547,60 @@
           <w:rFonts w:ascii="Times New Roman" w:hAnsi="Times New Roman" w:cs="Times New Roman"/>
           <w:sz w:val="28"/>
           <w:szCs w:val="28"/>
+          <w:lang w:val="vi-VN"/>
+        </w:rPr>
+      </w:pPr>
+      <w:r>
+        <w:rPr>
+          <w:rFonts w:ascii="Times New Roman" w:hAnsi="Times New Roman" w:cs="Times New Roman"/>
+          <w:sz w:val="28"/>
+          <w:szCs w:val="28"/>
+          <w:lang w:val="vi-VN"/>
+        </w:rPr>
+        <w:drawing>
+          <wp:inline distT="0" distB="0" distL="0" distR="0" wp14:anchorId="647D6F94" wp14:editId="458522E5">
+            <wp:extent cx="5760720" cy="4719320"/>
+            <wp:effectExtent l="0" t="0" r="0" b="5080"/>
+            <wp:docPr id="333824320" name="Picture 1"/>
+            <wp:cNvGraphicFramePr>
+              <a:graphicFrameLocks xmlns:a="http://schemas.openxmlformats.org/drawingml/2006/main" noChangeAspect="1"/>
+            </wp:cNvGraphicFramePr>
+            <a:graphic xmlns:a="http://schemas.openxmlformats.org/drawingml/2006/main">
+              <a:graphicData uri="http://schemas.openxmlformats.org/drawingml/2006/picture">
+                <pic:pic xmlns:pic="http://schemas.openxmlformats.org/drawingml/2006/picture">
+                  <pic:nvPicPr>
+                    <pic:cNvPr id="333824320" name=""/>
+                    <pic:cNvPicPr/>
+                  </pic:nvPicPr>
+                  <pic:blipFill>
+                    <a:blip r:embed="rId10"/>
+                    <a:stretch>
+                      <a:fillRect/>
+                    </a:stretch>
+                  </pic:blipFill>
+                  <pic:spPr>
+                    <a:xfrm>
+                      <a:off x="0" y="0"/>
+                      <a:ext cx="5760720" cy="4719320"/>
+                    </a:xfrm>
+                    <a:prstGeom prst="rect">
+                      <a:avLst/>
+                    </a:prstGeom>
+                  </pic:spPr>
+                </pic:pic>
+              </a:graphicData>
+            </a:graphic>
+          </wp:inline>
+        </w:drawing>
+      </w:r>
+    </w:p>
+    <w:p>
+      <w:pPr>
+        <w:rPr>
+          <w:rFonts w:ascii="Times New Roman" w:hAnsi="Times New Roman" w:cs="Times New Roman"/>
+          <w:sz w:val="28"/>
+          <w:szCs w:val="28"/>
+          <w:lang w:val="vi-VN"/>
         </w:rPr>
       </w:pPr>
       <w:r>
@@ -252,6 +618,61 @@
           <w:rFonts w:ascii="Times New Roman" w:hAnsi="Times New Roman" w:cs="Times New Roman"/>
           <w:sz w:val="28"/>
           <w:szCs w:val="28"/>
+          <w:lang w:val="vi-VN"/>
+        </w:rPr>
+      </w:pPr>
+      <w:r>
+        <w:rPr>
+          <w:rFonts w:ascii="Times New Roman" w:hAnsi="Times New Roman" w:cs="Times New Roman"/>
+          <w:sz w:val="28"/>
+          <w:szCs w:val="28"/>
+          <w:lang w:val="vi-VN"/>
+        </w:rPr>
+        <w:lastRenderedPageBreak/>
+        <w:drawing>
+          <wp:inline distT="0" distB="0" distL="0" distR="0" wp14:anchorId="07818C04" wp14:editId="3E91C789">
+            <wp:extent cx="5760720" cy="4476115"/>
+            <wp:effectExtent l="0" t="0" r="0" b="635"/>
+            <wp:docPr id="1697461623" name="Picture 1"/>
+            <wp:cNvGraphicFramePr>
+              <a:graphicFrameLocks xmlns:a="http://schemas.openxmlformats.org/drawingml/2006/main" noChangeAspect="1"/>
+            </wp:cNvGraphicFramePr>
+            <a:graphic xmlns:a="http://schemas.openxmlformats.org/drawingml/2006/main">
+              <a:graphicData uri="http://schemas.openxmlformats.org/drawingml/2006/picture">
+                <pic:pic xmlns:pic="http://schemas.openxmlformats.org/drawingml/2006/picture">
+                  <pic:nvPicPr>
+                    <pic:cNvPr id="1697461623" name=""/>
+                    <pic:cNvPicPr/>
+                  </pic:nvPicPr>
+                  <pic:blipFill>
+                    <a:blip r:embed="rId11"/>
+                    <a:stretch>
+                      <a:fillRect/>
+                    </a:stretch>
+                  </pic:blipFill>
+                  <pic:spPr>
+                    <a:xfrm>
+                      <a:off x="0" y="0"/>
+                      <a:ext cx="5760720" cy="4476115"/>
+                    </a:xfrm>
+                    <a:prstGeom prst="rect">
+                      <a:avLst/>
+                    </a:prstGeom>
+                  </pic:spPr>
+                </pic:pic>
+              </a:graphicData>
+            </a:graphic>
+          </wp:inline>
+        </w:drawing>
+      </w:r>
+    </w:p>
+    <w:p>
+      <w:pPr>
+        <w:rPr>
+          <w:rFonts w:ascii="Times New Roman" w:hAnsi="Times New Roman" w:cs="Times New Roman"/>
+          <w:sz w:val="28"/>
+          <w:szCs w:val="28"/>
+          <w:lang w:val="vi-VN"/>
         </w:rPr>
       </w:pPr>
       <w:r>
@@ -269,6 +690,60 @@
           <w:rFonts w:ascii="Times New Roman" w:hAnsi="Times New Roman" w:cs="Times New Roman"/>
           <w:sz w:val="28"/>
           <w:szCs w:val="28"/>
+          <w:lang w:val="vi-VN"/>
+        </w:rPr>
+      </w:pPr>
+      <w:r>
+        <w:rPr>
+          <w:rFonts w:ascii="Times New Roman" w:hAnsi="Times New Roman" w:cs="Times New Roman"/>
+          <w:sz w:val="28"/>
+          <w:szCs w:val="28"/>
+          <w:lang w:val="vi-VN"/>
+        </w:rPr>
+        <w:drawing>
+          <wp:inline distT="0" distB="0" distL="0" distR="0" wp14:anchorId="0AABB0AF" wp14:editId="3F1AC523">
+            <wp:extent cx="5760720" cy="2214245"/>
+            <wp:effectExtent l="0" t="0" r="0" b="0"/>
+            <wp:docPr id="1650467033" name="Picture 1"/>
+            <wp:cNvGraphicFramePr>
+              <a:graphicFrameLocks xmlns:a="http://schemas.openxmlformats.org/drawingml/2006/main" noChangeAspect="1"/>
+            </wp:cNvGraphicFramePr>
+            <a:graphic xmlns:a="http://schemas.openxmlformats.org/drawingml/2006/main">
+              <a:graphicData uri="http://schemas.openxmlformats.org/drawingml/2006/picture">
+                <pic:pic xmlns:pic="http://schemas.openxmlformats.org/drawingml/2006/picture">
+                  <pic:nvPicPr>
+                    <pic:cNvPr id="1650467033" name=""/>
+                    <pic:cNvPicPr/>
+                  </pic:nvPicPr>
+                  <pic:blipFill>
+                    <a:blip r:embed="rId12"/>
+                    <a:stretch>
+                      <a:fillRect/>
+                    </a:stretch>
+                  </pic:blipFill>
+                  <pic:spPr>
+                    <a:xfrm>
+                      <a:off x="0" y="0"/>
+                      <a:ext cx="5760720" cy="2214245"/>
+                    </a:xfrm>
+                    <a:prstGeom prst="rect">
+                      <a:avLst/>
+                    </a:prstGeom>
+                  </pic:spPr>
+                </pic:pic>
+              </a:graphicData>
+            </a:graphic>
+          </wp:inline>
+        </w:drawing>
+      </w:r>
+    </w:p>
+    <w:p>
+      <w:pPr>
+        <w:rPr>
+          <w:rFonts w:ascii="Times New Roman" w:hAnsi="Times New Roman" w:cs="Times New Roman"/>
+          <w:sz w:val="28"/>
+          <w:szCs w:val="28"/>
+          <w:lang w:val="vi-VN"/>
         </w:rPr>
       </w:pPr>
       <w:r>
@@ -286,6 +761,61 @@
           <w:rFonts w:ascii="Times New Roman" w:hAnsi="Times New Roman" w:cs="Times New Roman"/>
           <w:sz w:val="28"/>
           <w:szCs w:val="28"/>
+          <w:lang w:val="vi-VN"/>
+        </w:rPr>
+      </w:pPr>
+      <w:r>
+        <w:rPr>
+          <w:rFonts w:ascii="Times New Roman" w:hAnsi="Times New Roman" w:cs="Times New Roman"/>
+          <w:sz w:val="28"/>
+          <w:szCs w:val="28"/>
+          <w:lang w:val="vi-VN"/>
+        </w:rPr>
+        <w:lastRenderedPageBreak/>
+        <w:drawing>
+          <wp:inline distT="0" distB="0" distL="0" distR="0" wp14:anchorId="6ED5C1BE" wp14:editId="693993A3">
+            <wp:extent cx="5760720" cy="2880360"/>
+            <wp:effectExtent l="0" t="0" r="0" b="0"/>
+            <wp:docPr id="2017198961" name="Picture 1"/>
+            <wp:cNvGraphicFramePr>
+              <a:graphicFrameLocks xmlns:a="http://schemas.openxmlformats.org/drawingml/2006/main" noChangeAspect="1"/>
+            </wp:cNvGraphicFramePr>
+            <a:graphic xmlns:a="http://schemas.openxmlformats.org/drawingml/2006/main">
+              <a:graphicData uri="http://schemas.openxmlformats.org/drawingml/2006/picture">
+                <pic:pic xmlns:pic="http://schemas.openxmlformats.org/drawingml/2006/picture">
+                  <pic:nvPicPr>
+                    <pic:cNvPr id="2017198961" name=""/>
+                    <pic:cNvPicPr/>
+                  </pic:nvPicPr>
+                  <pic:blipFill>
+                    <a:blip r:embed="rId13"/>
+                    <a:stretch>
+                      <a:fillRect/>
+                    </a:stretch>
+                  </pic:blipFill>
+                  <pic:spPr>
+                    <a:xfrm>
+                      <a:off x="0" y="0"/>
+                      <a:ext cx="5760720" cy="2880360"/>
+                    </a:xfrm>
+                    <a:prstGeom prst="rect">
+                      <a:avLst/>
+                    </a:prstGeom>
+                  </pic:spPr>
+                </pic:pic>
+              </a:graphicData>
+            </a:graphic>
+          </wp:inline>
+        </w:drawing>
+      </w:r>
+    </w:p>
+    <w:p>
+      <w:pPr>
+        <w:rPr>
+          <w:rFonts w:ascii="Times New Roman" w:hAnsi="Times New Roman" w:cs="Times New Roman"/>
+          <w:sz w:val="28"/>
+          <w:szCs w:val="28"/>
+          <w:lang w:val="vi-VN"/>
         </w:rPr>
       </w:pPr>
       <w:r>
@@ -299,10 +829,119 @@
     </w:p>
     <w:p>
       <w:pPr>
-        <w:rPr>
-          <w:rFonts w:ascii="Times New Roman" w:hAnsi="Times New Roman" w:cs="Times New Roman"/>
-          <w:sz w:val="28"/>
-          <w:szCs w:val="28"/>
+        <w:jc w:val="center"/>
+        <w:rPr>
+          <w:rFonts w:ascii="Times New Roman" w:hAnsi="Times New Roman" w:cs="Times New Roman"/>
+          <w:sz w:val="28"/>
+          <w:szCs w:val="28"/>
+          <w:lang w:val="vi-VN"/>
+        </w:rPr>
+      </w:pPr>
+      <w:r>
+        <w:rPr>
+          <w:rFonts w:ascii="Times New Roman" w:hAnsi="Times New Roman" w:cs="Times New Roman"/>
+          <w:sz w:val="28"/>
+          <w:szCs w:val="28"/>
+          <w:lang w:val="vi-VN"/>
+        </w:rPr>
+        <w:drawing>
+          <wp:inline distT="0" distB="0" distL="0" distR="0" wp14:anchorId="5B449B75" wp14:editId="720CCA37">
+            <wp:extent cx="3010161" cy="2217612"/>
+            <wp:effectExtent l="0" t="0" r="0" b="0"/>
+            <wp:docPr id="1220315291" name="Picture 1"/>
+            <wp:cNvGraphicFramePr>
+              <a:graphicFrameLocks xmlns:a="http://schemas.openxmlformats.org/drawingml/2006/main" noChangeAspect="1"/>
+            </wp:cNvGraphicFramePr>
+            <a:graphic xmlns:a="http://schemas.openxmlformats.org/drawingml/2006/main">
+              <a:graphicData uri="http://schemas.openxmlformats.org/drawingml/2006/picture">
+                <pic:pic xmlns:pic="http://schemas.openxmlformats.org/drawingml/2006/picture">
+                  <pic:nvPicPr>
+                    <pic:cNvPr id="1220315291" name=""/>
+                    <pic:cNvPicPr/>
+                  </pic:nvPicPr>
+                  <pic:blipFill>
+                    <a:blip r:embed="rId14"/>
+                    <a:stretch>
+                      <a:fillRect/>
+                    </a:stretch>
+                  </pic:blipFill>
+                  <pic:spPr>
+                    <a:xfrm>
+                      <a:off x="0" y="0"/>
+                      <a:ext cx="3010161" cy="2217612"/>
+                    </a:xfrm>
+                    <a:prstGeom prst="rect">
+                      <a:avLst/>
+                    </a:prstGeom>
+                  </pic:spPr>
+                </pic:pic>
+              </a:graphicData>
+            </a:graphic>
+          </wp:inline>
+        </w:drawing>
+      </w:r>
+    </w:p>
+    <w:p>
+      <w:pPr>
+        <w:jc w:val="center"/>
+        <w:rPr>
+          <w:rFonts w:ascii="Times New Roman" w:hAnsi="Times New Roman" w:cs="Times New Roman"/>
+          <w:sz w:val="28"/>
+          <w:szCs w:val="28"/>
+          <w:lang w:val="vi-VN"/>
+        </w:rPr>
+      </w:pPr>
+      <w:r>
+        <w:rPr>
+          <w:rFonts w:ascii="Times New Roman" w:hAnsi="Times New Roman" w:cs="Times New Roman"/>
+          <w:sz w:val="28"/>
+          <w:szCs w:val="28"/>
+          <w:lang w:val="vi-VN"/>
+        </w:rPr>
+        <w:drawing>
+          <wp:inline distT="0" distB="0" distL="0" distR="0" wp14:anchorId="53205354" wp14:editId="1A29AE96">
+            <wp:extent cx="4961050" cy="1425063"/>
+            <wp:effectExtent l="0" t="0" r="0" b="3810"/>
+            <wp:docPr id="1550704736" name="Picture 1"/>
+            <wp:cNvGraphicFramePr>
+              <a:graphicFrameLocks xmlns:a="http://schemas.openxmlformats.org/drawingml/2006/main" noChangeAspect="1"/>
+            </wp:cNvGraphicFramePr>
+            <a:graphic xmlns:a="http://schemas.openxmlformats.org/drawingml/2006/main">
+              <a:graphicData uri="http://schemas.openxmlformats.org/drawingml/2006/picture">
+                <pic:pic xmlns:pic="http://schemas.openxmlformats.org/drawingml/2006/picture">
+                  <pic:nvPicPr>
+                    <pic:cNvPr id="1550704736" name=""/>
+                    <pic:cNvPicPr/>
+                  </pic:nvPicPr>
+                  <pic:blipFill>
+                    <a:blip r:embed="rId15"/>
+                    <a:stretch>
+                      <a:fillRect/>
+                    </a:stretch>
+                  </pic:blipFill>
+                  <pic:spPr>
+                    <a:xfrm>
+                      <a:off x="0" y="0"/>
+                      <a:ext cx="4961050" cy="1425063"/>
+                    </a:xfrm>
+                    <a:prstGeom prst="rect">
+                      <a:avLst/>
+                    </a:prstGeom>
+                  </pic:spPr>
+                </pic:pic>
+              </a:graphicData>
+            </a:graphic>
+          </wp:inline>
+        </w:drawing>
+      </w:r>
+    </w:p>
+    <w:p>
+      <w:pPr>
+        <w:rPr>
+          <w:rFonts w:ascii="Times New Roman" w:hAnsi="Times New Roman" w:cs="Times New Roman"/>
+          <w:sz w:val="28"/>
+          <w:szCs w:val="28"/>
+          <w:lang w:val="vi-VN"/>
         </w:rPr>
       </w:pPr>
       <w:r>
@@ -320,6 +959,61 @@
           <w:rFonts w:ascii="Times New Roman" w:hAnsi="Times New Roman" w:cs="Times New Roman"/>
           <w:sz w:val="28"/>
           <w:szCs w:val="28"/>
+          <w:lang w:val="vi-VN"/>
+        </w:rPr>
+      </w:pPr>
+      <w:r>
+        <w:rPr>
+          <w:rFonts w:ascii="Times New Roman" w:hAnsi="Times New Roman" w:cs="Times New Roman"/>
+          <w:sz w:val="28"/>
+          <w:szCs w:val="28"/>
+          <w:lang w:val="vi-VN"/>
+        </w:rPr>
+        <w:lastRenderedPageBreak/>
+        <w:drawing>
+          <wp:inline distT="0" distB="0" distL="0" distR="0" wp14:anchorId="2027A68F" wp14:editId="63F532A1">
+            <wp:extent cx="5760720" cy="1864995"/>
+            <wp:effectExtent l="0" t="0" r="0" b="1905"/>
+            <wp:docPr id="256491" name="Picture 1"/>
+            <wp:cNvGraphicFramePr>
+              <a:graphicFrameLocks xmlns:a="http://schemas.openxmlformats.org/drawingml/2006/main" noChangeAspect="1"/>
+            </wp:cNvGraphicFramePr>
+            <a:graphic xmlns:a="http://schemas.openxmlformats.org/drawingml/2006/main">
+              <a:graphicData uri="http://schemas.openxmlformats.org/drawingml/2006/picture">
+                <pic:pic xmlns:pic="http://schemas.openxmlformats.org/drawingml/2006/picture">
+                  <pic:nvPicPr>
+                    <pic:cNvPr id="256491" name=""/>
+                    <pic:cNvPicPr/>
+                  </pic:nvPicPr>
+                  <pic:blipFill>
+                    <a:blip r:embed="rId16"/>
+                    <a:stretch>
+                      <a:fillRect/>
+                    </a:stretch>
+                  </pic:blipFill>
+                  <pic:spPr>
+                    <a:xfrm>
+                      <a:off x="0" y="0"/>
+                      <a:ext cx="5760720" cy="1864995"/>
+                    </a:xfrm>
+                    <a:prstGeom prst="rect">
+                      <a:avLst/>
+                    </a:prstGeom>
+                  </pic:spPr>
+                </pic:pic>
+              </a:graphicData>
+            </a:graphic>
+          </wp:inline>
+        </w:drawing>
+      </w:r>
+    </w:p>
+    <w:p>
+      <w:pPr>
+        <w:rPr>
+          <w:rFonts w:ascii="Times New Roman" w:hAnsi="Times New Roman" w:cs="Times New Roman"/>
+          <w:sz w:val="28"/>
+          <w:szCs w:val="28"/>
+          <w:lang w:val="vi-VN"/>
         </w:rPr>
       </w:pPr>
       <w:r>
@@ -333,37 +1027,199 @@
     </w:p>
     <w:p>
       <w:pPr>
-        <w:rPr>
-          <w:rFonts w:ascii="Times New Roman" w:hAnsi="Times New Roman" w:cs="Times New Roman"/>
-          <w:sz w:val="28"/>
-          <w:szCs w:val="28"/>
-        </w:rPr>
-      </w:pPr>
-      <w:r>
-        <w:rPr>
-          <w:rFonts w:ascii="Times New Roman" w:hAnsi="Times New Roman" w:cs="Times New Roman"/>
-          <w:sz w:val="28"/>
-          <w:szCs w:val="28"/>
+        <w:jc w:val="center"/>
+        <w:rPr>
+          <w:rFonts w:ascii="Times New Roman" w:hAnsi="Times New Roman" w:cs="Times New Roman"/>
+          <w:sz w:val="28"/>
+          <w:szCs w:val="28"/>
+          <w:lang w:val="vi-VN"/>
+        </w:rPr>
+      </w:pPr>
+      <w:r>
+        <w:rPr>
+          <w:rFonts w:ascii="Times New Roman" w:hAnsi="Times New Roman" w:cs="Times New Roman"/>
+          <w:sz w:val="28"/>
+          <w:szCs w:val="28"/>
+          <w:lang w:val="vi-VN"/>
+        </w:rPr>
+        <w:drawing>
+          <wp:inline distT="0" distB="0" distL="0" distR="0" wp14:anchorId="2B98251D" wp14:editId="06D48F86">
+            <wp:extent cx="4229467" cy="3254022"/>
+            <wp:effectExtent l="0" t="0" r="0" b="3810"/>
+            <wp:docPr id="700961140" name="Picture 1"/>
+            <wp:cNvGraphicFramePr>
+              <a:graphicFrameLocks xmlns:a="http://schemas.openxmlformats.org/drawingml/2006/main" noChangeAspect="1"/>
+            </wp:cNvGraphicFramePr>
+            <a:graphic xmlns:a="http://schemas.openxmlformats.org/drawingml/2006/main">
+              <a:graphicData uri="http://schemas.openxmlformats.org/drawingml/2006/picture">
+                <pic:pic xmlns:pic="http://schemas.openxmlformats.org/drawingml/2006/picture">
+                  <pic:nvPicPr>
+                    <pic:cNvPr id="700961140" name=""/>
+                    <pic:cNvPicPr/>
+                  </pic:nvPicPr>
+                  <pic:blipFill>
+                    <a:blip r:embed="rId17"/>
+                    <a:stretch>
+                      <a:fillRect/>
+                    </a:stretch>
+                  </pic:blipFill>
+                  <pic:spPr>
+                    <a:xfrm>
+                      <a:off x="0" y="0"/>
+                      <a:ext cx="4229467" cy="3254022"/>
+                    </a:xfrm>
+                    <a:prstGeom prst="rect">
+                      <a:avLst/>
+                    </a:prstGeom>
+                  </pic:spPr>
+                </pic:pic>
+              </a:graphicData>
+            </a:graphic>
+          </wp:inline>
+        </w:drawing>
+      </w:r>
+    </w:p>
+    <w:p>
+      <w:pPr>
+        <w:rPr>
+          <w:rFonts w:ascii="Times New Roman" w:hAnsi="Times New Roman" w:cs="Times New Roman"/>
+          <w:sz w:val="28"/>
+          <w:szCs w:val="28"/>
+          <w:lang w:val="vi-VN"/>
+        </w:rPr>
+      </w:pPr>
+      <w:r>
+        <w:rPr>
+          <w:rFonts w:ascii="Times New Roman" w:hAnsi="Times New Roman" w:cs="Times New Roman"/>
+          <w:sz w:val="28"/>
+          <w:szCs w:val="28"/>
+        </w:rPr>
+        <w:t xml:space="preserve">Câu 77. Thực hiện cập nhật một sinh viên từ giao diện React. (Gợi ý: Sử dụng API PUT /api/students/:id.) </w:t>
+      </w:r>
+    </w:p>
+    <w:p>
+      <w:pPr>
+        <w:rPr>
+          <w:rFonts w:ascii="Times New Roman" w:hAnsi="Times New Roman" w:cs="Times New Roman"/>
+          <w:sz w:val="28"/>
+          <w:szCs w:val="28"/>
+          <w:lang w:val="vi-VN"/>
+        </w:rPr>
+      </w:pPr>
+      <w:r>
+        <w:rPr>
+          <w:rFonts w:ascii="Times New Roman" w:hAnsi="Times New Roman" w:cs="Times New Roman"/>
+          <w:sz w:val="28"/>
+          <w:szCs w:val="28"/>
+          <w:lang w:val="vi-VN"/>
+        </w:rPr>
+        <w:drawing>
+          <wp:inline distT="0" distB="0" distL="0" distR="0" wp14:anchorId="225F49EE" wp14:editId="2CC79251">
+            <wp:extent cx="5760720" cy="1546225"/>
+            <wp:effectExtent l="0" t="0" r="0" b="0"/>
+            <wp:docPr id="1201775724" name="Picture 1"/>
+            <wp:cNvGraphicFramePr>
+              <a:graphicFrameLocks xmlns:a="http://schemas.openxmlformats.org/drawingml/2006/main" noChangeAspect="1"/>
+            </wp:cNvGraphicFramePr>
+            <a:graphic xmlns:a="http://schemas.openxmlformats.org/drawingml/2006/main">
+              <a:graphicData uri="http://schemas.openxmlformats.org/drawingml/2006/picture">
+                <pic:pic xmlns:pic="http://schemas.openxmlformats.org/drawingml/2006/picture">
+                  <pic:nvPicPr>
+                    <pic:cNvPr id="1201775724" name=""/>
+                    <pic:cNvPicPr/>
+                  </pic:nvPicPr>
+                  <pic:blipFill>
+                    <a:blip r:embed="rId18"/>
+                    <a:stretch>
+                      <a:fillRect/>
+                    </a:stretch>
+                  </pic:blipFill>
+                  <pic:spPr>
+                    <a:xfrm>
+                      <a:off x="0" y="0"/>
+                      <a:ext cx="5760720" cy="1546225"/>
+                    </a:xfrm>
+                    <a:prstGeom prst="rect">
+                      <a:avLst/>
+                    </a:prstGeom>
+                  </pic:spPr>
+                </pic:pic>
+              </a:graphicData>
+            </a:graphic>
+          </wp:inline>
+        </w:drawing>
+      </w:r>
+    </w:p>
+    <w:p>
+      <w:pPr>
+        <w:rPr>
+          <w:rFonts w:ascii="Times New Roman" w:hAnsi="Times New Roman" w:cs="Times New Roman"/>
+          <w:sz w:val="28"/>
+          <w:szCs w:val="28"/>
+          <w:lang w:val="vi-VN"/>
+        </w:rPr>
+      </w:pPr>
+      <w:r>
+        <w:rPr>
+          <w:rFonts w:ascii="Times New Roman" w:hAnsi="Times New Roman" w:cs="Times New Roman"/>
+          <w:sz w:val="28"/>
+          <w:szCs w:val="28"/>
+        </w:rPr>
+        <w:t xml:space="preserve">Câu 78. Thực hiện xóa một sinh viên từ giao diện React. (Gợi ý: Sử dụng API DELETE /api/students/:id.) </w:t>
+      </w:r>
+    </w:p>
+    <w:p>
+      <w:pPr>
+        <w:rPr>
+          <w:rFonts w:ascii="Times New Roman" w:hAnsi="Times New Roman" w:cs="Times New Roman"/>
+          <w:sz w:val="28"/>
+          <w:szCs w:val="28"/>
+          <w:lang w:val="vi-VN"/>
+        </w:rPr>
+      </w:pPr>
+      <w:r>
+        <w:rPr>
+          <w:rFonts w:ascii="Times New Roman" w:hAnsi="Times New Roman" w:cs="Times New Roman"/>
+          <w:sz w:val="28"/>
+          <w:szCs w:val="28"/>
+          <w:lang w:val="vi-VN"/>
         </w:rPr>
         <w:lastRenderedPageBreak/>
-        <w:t xml:space="preserve">Câu 77. Thực hiện cập nhật một sinh viên từ giao diện React. (Gợi ý: Sử dụng API PUT /api/students/:id.) </w:t>
-      </w:r>
-    </w:p>
-    <w:p>
-      <w:pPr>
-        <w:rPr>
-          <w:rFonts w:ascii="Times New Roman" w:hAnsi="Times New Roman" w:cs="Times New Roman"/>
-          <w:sz w:val="28"/>
-          <w:szCs w:val="28"/>
-        </w:rPr>
-      </w:pPr>
-      <w:r>
-        <w:rPr>
-          <w:rFonts w:ascii="Times New Roman" w:hAnsi="Times New Roman" w:cs="Times New Roman"/>
-          <w:sz w:val="28"/>
-          <w:szCs w:val="28"/>
-        </w:rPr>
-        <w:t xml:space="preserve">Câu 78. Thực hiện xóa một sinh viên từ giao diện React. (Gợi ý: Sử dụng API DELETE /api/students/:id.) </w:t>
+        <w:drawing>
+          <wp:inline distT="0" distB="0" distL="0" distR="0" wp14:anchorId="727734F9" wp14:editId="0DCD00D6">
+            <wp:extent cx="5760720" cy="2595245"/>
+            <wp:effectExtent l="0" t="0" r="0" b="0"/>
+            <wp:docPr id="2137434954" name="Picture 1"/>
+            <wp:cNvGraphicFramePr>
+              <a:graphicFrameLocks xmlns:a="http://schemas.openxmlformats.org/drawingml/2006/main" noChangeAspect="1"/>
+            </wp:cNvGraphicFramePr>
+            <a:graphic xmlns:a="http://schemas.openxmlformats.org/drawingml/2006/main">
+              <a:graphicData uri="http://schemas.openxmlformats.org/drawingml/2006/picture">
+                <pic:pic xmlns:pic="http://schemas.openxmlformats.org/drawingml/2006/picture">
+                  <pic:nvPicPr>
+                    <pic:cNvPr id="2137434954" name=""/>
+                    <pic:cNvPicPr/>
+                  </pic:nvPicPr>
+                  <pic:blipFill>
+                    <a:blip r:embed="rId19"/>
+                    <a:stretch>
+                      <a:fillRect/>
+                    </a:stretch>
+                  </pic:blipFill>
+                  <pic:spPr>
+                    <a:xfrm>
+                      <a:off x="0" y="0"/>
+                      <a:ext cx="5760720" cy="2595245"/>
+                    </a:xfrm>
+                    <a:prstGeom prst="rect">
+                      <a:avLst/>
+                    </a:prstGeom>
+                  </pic:spPr>
+                </pic:pic>
+              </a:graphicData>
+            </a:graphic>
+          </wp:inline>
+        </w:drawing>
       </w:r>
     </w:p>
     <w:p>
@@ -375,6 +1231,7 @@
           <w:bCs/>
           <w:sz w:val="28"/>
           <w:szCs w:val="28"/>
+          <w:lang w:val="vi-VN"/>
         </w:rPr>
       </w:pPr>
       <w:r>
@@ -384,8 +1241,43 @@
           <w:bCs/>
           <w:sz w:val="28"/>
           <w:szCs w:val="28"/>
-        </w:rPr>
-        <w:t>PHẦN 6. DOCKER COMPOSE CHO ỨNG</w:t>
+          <w:lang w:val="vi-VN"/>
+        </w:rPr>
+        <w:drawing>
+          <wp:inline distT="0" distB="0" distL="0" distR="0" wp14:anchorId="27698349" wp14:editId="51941A1B">
+            <wp:extent cx="5760720" cy="1616710"/>
+            <wp:effectExtent l="0" t="0" r="0" b="2540"/>
+            <wp:docPr id="2090440680" name="Picture 1"/>
+            <wp:cNvGraphicFramePr>
+              <a:graphicFrameLocks xmlns:a="http://schemas.openxmlformats.org/drawingml/2006/main" noChangeAspect="1"/>
+            </wp:cNvGraphicFramePr>
+            <a:graphic xmlns:a="http://schemas.openxmlformats.org/drawingml/2006/main">
+              <a:graphicData uri="http://schemas.openxmlformats.org/drawingml/2006/picture">
+                <pic:pic xmlns:pic="http://schemas.openxmlformats.org/drawingml/2006/picture">
+                  <pic:nvPicPr>
+                    <pic:cNvPr id="2090440680" name=""/>
+                    <pic:cNvPicPr/>
+                  </pic:nvPicPr>
+                  <pic:blipFill>
+                    <a:blip r:embed="rId20"/>
+                    <a:stretch>
+                      <a:fillRect/>
+                    </a:stretch>
+                  </pic:blipFill>
+                  <pic:spPr>
+                    <a:xfrm>
+                      <a:off x="0" y="0"/>
+                      <a:ext cx="5760720" cy="1616710"/>
+                    </a:xfrm>
+                    <a:prstGeom prst="rect">
+                      <a:avLst/>
+                    </a:prstGeom>
+                  </pic:spPr>
+                </pic:pic>
+              </a:graphicData>
+            </a:graphic>
+          </wp:inline>
+        </w:drawing>
       </w:r>
     </w:p>
     <w:p>
@@ -407,347 +1299,7 @@
           <w:sz w:val="28"/>
           <w:szCs w:val="28"/>
         </w:rPr>
-        <w:t>DỤNG MERN</w:t>
-      </w:r>
-    </w:p>
-    <w:p>
-      <w:pPr>
-        <w:rPr>
-          <w:rFonts w:ascii="Times New Roman" w:hAnsi="Times New Roman" w:cs="Times New Roman"/>
-          <w:sz w:val="28"/>
-          <w:szCs w:val="28"/>
-        </w:rPr>
-      </w:pPr>
-      <w:r>
-        <w:rPr>
-          <w:rFonts w:ascii="Times New Roman" w:hAnsi="Times New Roman" w:cs="Times New Roman"/>
-          <w:sz w:val="28"/>
-          <w:szCs w:val="28"/>
-        </w:rPr>
-        <w:t xml:space="preserve">Câu 79. Dừng các Container Backend và Frontend đang chạy. (Gợi ý lệnh: docker stop ...) </w:t>
-      </w:r>
-    </w:p>
-    <w:p>
-      <w:pPr>
-        <w:rPr>
-          <w:rFonts w:ascii="Times New Roman" w:hAnsi="Times New Roman" w:cs="Times New Roman"/>
-          <w:sz w:val="28"/>
-          <w:szCs w:val="28"/>
-        </w:rPr>
-      </w:pPr>
-      <w:r>
-        <w:rPr>
-          <w:rFonts w:ascii="Times New Roman" w:hAnsi="Times New Roman" w:cs="Times New Roman"/>
-          <w:sz w:val="28"/>
-          <w:szCs w:val="28"/>
-        </w:rPr>
-        <w:t xml:space="preserve">Câu 80. Tạo file docker-compose.yml tại thư mục gốc của Repository. (Gợi ý lệnh: touch docker-compose.yml) </w:t>
-      </w:r>
-    </w:p>
-    <w:p>
-      <w:pPr>
-        <w:rPr>
-          <w:rFonts w:ascii="Times New Roman" w:hAnsi="Times New Roman" w:cs="Times New Roman"/>
-          <w:sz w:val="28"/>
-          <w:szCs w:val="28"/>
-        </w:rPr>
-      </w:pPr>
-      <w:r>
-        <w:rPr>
-          <w:rFonts w:ascii="Times New Roman" w:hAnsi="Times New Roman" w:cs="Times New Roman"/>
-          <w:sz w:val="28"/>
-          <w:szCs w:val="28"/>
-        </w:rPr>
-        <w:t xml:space="preserve">Câu 81. Khai báo Service backend trong Docker Compose. (Gợi ý: Sử dụng thuộc tính services và build.) </w:t>
-      </w:r>
-    </w:p>
-    <w:p>
-      <w:pPr>
-        <w:rPr>
-          <w:rFonts w:ascii="Times New Roman" w:hAnsi="Times New Roman" w:cs="Times New Roman"/>
-          <w:sz w:val="28"/>
-          <w:szCs w:val="28"/>
-        </w:rPr>
-      </w:pPr>
-      <w:r>
-        <w:rPr>
-          <w:rFonts w:ascii="Times New Roman" w:hAnsi="Times New Roman" w:cs="Times New Roman"/>
-          <w:sz w:val="28"/>
-          <w:szCs w:val="28"/>
-        </w:rPr>
-        <w:t xml:space="preserve">Câu 82. Khai báo Service frontend trong Docker Compose. (Gợi ý: Sử dụng thuộc tính services và build.) </w:t>
-      </w:r>
-    </w:p>
-    <w:p>
-      <w:pPr>
-        <w:rPr>
-          <w:rFonts w:ascii="Times New Roman" w:hAnsi="Times New Roman" w:cs="Times New Roman"/>
-          <w:sz w:val="28"/>
-          <w:szCs w:val="28"/>
-        </w:rPr>
-      </w:pPr>
-      <w:r>
-        <w:rPr>
-          <w:rFonts w:ascii="Times New Roman" w:hAnsi="Times New Roman" w:cs="Times New Roman"/>
-          <w:sz w:val="28"/>
-          <w:szCs w:val="28"/>
-        </w:rPr>
-        <w:t xml:space="preserve">Câu 83. Cấu hình Port cho Service backend. (Gợi ý: Ánh xạ port 5000 của Container ra port trên máy local.) </w:t>
-      </w:r>
-    </w:p>
-    <w:p>
-      <w:pPr>
-        <w:rPr>
-          <w:rFonts w:ascii="Times New Roman" w:hAnsi="Times New Roman" w:cs="Times New Roman"/>
-          <w:sz w:val="28"/>
-          <w:szCs w:val="28"/>
-        </w:rPr>
-      </w:pPr>
-      <w:r>
-        <w:rPr>
-          <w:rFonts w:ascii="Times New Roman" w:hAnsi="Times New Roman" w:cs="Times New Roman"/>
-          <w:sz w:val="28"/>
-          <w:szCs w:val="28"/>
-        </w:rPr>
-        <w:t xml:space="preserve">Câu 84. Cấu hình Port cho Service frontend. (Gợi ý: Ánh xạ port của Frontend Container ra port trên máy local.) </w:t>
-      </w:r>
-    </w:p>
-    <w:p>
-      <w:pPr>
-        <w:rPr>
-          <w:rFonts w:ascii="Times New Roman" w:hAnsi="Times New Roman" w:cs="Times New Roman"/>
-          <w:sz w:val="28"/>
-          <w:szCs w:val="28"/>
-        </w:rPr>
-      </w:pPr>
-      <w:r>
-        <w:rPr>
-          <w:rFonts w:ascii="Times New Roman" w:hAnsi="Times New Roman" w:cs="Times New Roman"/>
-          <w:sz w:val="28"/>
-          <w:szCs w:val="28"/>
-        </w:rPr>
-        <w:t xml:space="preserve">Câu 85. Cấu hình biến môi trường MONGODB_URI cho Backend trong Docker Compose. (Gợi ý: Sử dụng thuộc tính environment.) </w:t>
-      </w:r>
-    </w:p>
-    <w:p>
-      <w:pPr>
-        <w:rPr>
-          <w:rFonts w:ascii="Times New Roman" w:hAnsi="Times New Roman" w:cs="Times New Roman"/>
-          <w:sz w:val="28"/>
-          <w:szCs w:val="28"/>
-        </w:rPr>
-      </w:pPr>
-      <w:r>
-        <w:rPr>
-          <w:rFonts w:ascii="Times New Roman" w:hAnsi="Times New Roman" w:cs="Times New Roman"/>
-          <w:sz w:val="28"/>
-          <w:szCs w:val="28"/>
-        </w:rPr>
-        <w:t xml:space="preserve">Câu 86. Khởi động toàn bộ ứng dụng MERN bằng Docker Compose. (Gợi ý lệnh: docker compose up -d --build) </w:t>
-      </w:r>
-    </w:p>
-    <w:p>
-      <w:pPr>
-        <w:rPr>
-          <w:rFonts w:ascii="Times New Roman" w:hAnsi="Times New Roman" w:cs="Times New Roman"/>
-          <w:sz w:val="28"/>
-          <w:szCs w:val="28"/>
-        </w:rPr>
-      </w:pPr>
-      <w:r>
-        <w:rPr>
-          <w:rFonts w:ascii="Times New Roman" w:hAnsi="Times New Roman" w:cs="Times New Roman"/>
-          <w:sz w:val="28"/>
-          <w:szCs w:val="28"/>
-        </w:rPr>
-        <w:t xml:space="preserve">Câu 87. Kiểm tra trạng thái các Service đang chạy. (Gợi ý lệnh: docker compose ps) </w:t>
-      </w:r>
-    </w:p>
-    <w:p>
-      <w:pPr>
-        <w:rPr>
-          <w:rFonts w:ascii="Times New Roman" w:hAnsi="Times New Roman" w:cs="Times New Roman"/>
-          <w:sz w:val="28"/>
-          <w:szCs w:val="28"/>
-        </w:rPr>
-      </w:pPr>
-      <w:r>
-        <w:rPr>
-          <w:rFonts w:ascii="Times New Roman" w:hAnsi="Times New Roman" w:cs="Times New Roman"/>
-          <w:sz w:val="28"/>
-          <w:szCs w:val="28"/>
-        </w:rPr>
-        <w:t xml:space="preserve">Câu 88. Xem log của Backend Service. (Gợi ý lệnh: docker compose logs backend) </w:t>
-      </w:r>
-    </w:p>
-    <w:p>
-      <w:pPr>
-        <w:rPr>
-          <w:rFonts w:ascii="Times New Roman" w:hAnsi="Times New Roman" w:cs="Times New Roman"/>
-          <w:sz w:val="28"/>
-          <w:szCs w:val="28"/>
-        </w:rPr>
-      </w:pPr>
-      <w:r>
-        <w:rPr>
-          <w:rFonts w:ascii="Times New Roman" w:hAnsi="Times New Roman" w:cs="Times New Roman"/>
-          <w:sz w:val="28"/>
-          <w:szCs w:val="28"/>
-        </w:rPr>
-        <w:t xml:space="preserve">Câu 89. Truy cập React Frontend bằng trình duyệt. (Gợi ý: Truy cập </w:t>
-      </w:r>
-    </w:p>
-    <w:p>
-      <w:pPr>
-        <w:rPr>
-          <w:rFonts w:ascii="Times New Roman" w:hAnsi="Times New Roman" w:cs="Times New Roman"/>
-          <w:sz w:val="28"/>
-          <w:szCs w:val="28"/>
-        </w:rPr>
-      </w:pPr>
-      <w:r>
-        <w:rPr>
-          <w:rFonts w:ascii="Times New Roman" w:hAnsi="Times New Roman" w:cs="Times New Roman"/>
-          <w:sz w:val="28"/>
-          <w:szCs w:val="28"/>
-        </w:rPr>
-        <w:t xml:space="preserve">http://localhost:&lt;port&gt;.) </w:t>
-      </w:r>
-    </w:p>
-    <w:p>
-      <w:pPr>
-        <w:rPr>
-          <w:rFonts w:ascii="Times New Roman" w:hAnsi="Times New Roman" w:cs="Times New Roman"/>
-          <w:sz w:val="28"/>
-          <w:szCs w:val="28"/>
-        </w:rPr>
-      </w:pPr>
-      <w:r>
-        <w:rPr>
-          <w:rFonts w:ascii="Times New Roman" w:hAnsi="Times New Roman" w:cs="Times New Roman"/>
-          <w:sz w:val="28"/>
-          <w:szCs w:val="28"/>
-        </w:rPr>
-        <w:t xml:space="preserve">Câu 90. Kiểm tra chức năng lấy danh sách sinh viên từ MongoDB Atlas. (Gợi ý: Kiểm tra luồng React → Backend → MongoDB Atlas.) </w:t>
-      </w:r>
-    </w:p>
-    <w:p>
-      <w:pPr>
-        <w:rPr>
-          <w:rFonts w:ascii="Times New Roman" w:hAnsi="Times New Roman" w:cs="Times New Roman"/>
-          <w:sz w:val="28"/>
-          <w:szCs w:val="28"/>
-        </w:rPr>
-      </w:pPr>
-      <w:r>
-        <w:rPr>
-          <w:rFonts w:ascii="Times New Roman" w:hAnsi="Times New Roman" w:cs="Times New Roman"/>
-          <w:sz w:val="28"/>
-          <w:szCs w:val="28"/>
-        </w:rPr>
-        <w:lastRenderedPageBreak/>
-        <w:t xml:space="preserve">Câu 91. Thêm một sinh viên và kiểm tra dữ liệu trên MongoDB Atlas. (Gợi ý: Sử dụng Form </w:t>
-      </w:r>
-      <w:r>
-        <w:rPr>
-          <w:rFonts w:ascii="Times New Roman" w:hAnsi="Times New Roman" w:cs="Times New Roman"/>
-          <w:sz w:val="28"/>
-          <w:szCs w:val="28"/>
-        </w:rPr>
-        <w:t>t</w:t>
-      </w:r>
-      <w:r>
-        <w:rPr>
-          <w:rFonts w:ascii="Times New Roman" w:hAnsi="Times New Roman" w:cs="Times New Roman"/>
-          <w:sz w:val="28"/>
-          <w:szCs w:val="28"/>
-        </w:rPr>
-        <w:t xml:space="preserve">rên React.) </w:t>
-      </w:r>
-    </w:p>
-    <w:p>
-      <w:pPr>
-        <w:rPr>
-          <w:rFonts w:ascii="Times New Roman" w:hAnsi="Times New Roman" w:cs="Times New Roman"/>
-          <w:sz w:val="28"/>
-          <w:szCs w:val="28"/>
-        </w:rPr>
-      </w:pPr>
-      <w:r>
-        <w:rPr>
-          <w:rFonts w:ascii="Times New Roman" w:hAnsi="Times New Roman" w:cs="Times New Roman"/>
-          <w:sz w:val="28"/>
-          <w:szCs w:val="28"/>
-        </w:rPr>
-        <w:t xml:space="preserve">Câu 92. Dừng toàn bộ hệ thống MERN bằng Docker Compose. (Gợi ý lệnh: docker compose down) </w:t>
-      </w:r>
-    </w:p>
-    <w:p>
-      <w:pPr>
-        <w:rPr>
-          <w:rFonts w:ascii="Times New Roman" w:hAnsi="Times New Roman" w:cs="Times New Roman"/>
-          <w:sz w:val="28"/>
-          <w:szCs w:val="28"/>
-        </w:rPr>
-      </w:pPr>
-      <w:r>
-        <w:rPr>
-          <w:rFonts w:ascii="Times New Roman" w:hAnsi="Times New Roman" w:cs="Times New Roman"/>
-          <w:sz w:val="28"/>
-          <w:szCs w:val="28"/>
-        </w:rPr>
-        <w:t xml:space="preserve">Câu 93. Khởi động lại toàn bộ hệ thống bằng Docker Compose. (Gợi ý lệnh: docker compose up -d) </w:t>
-      </w:r>
-    </w:p>
-    <w:p>
-      <w:pPr>
-        <w:rPr>
-          <w:rFonts w:ascii="Times New Roman" w:hAnsi="Times New Roman" w:cs="Times New Roman"/>
-          <w:sz w:val="28"/>
-          <w:szCs w:val="28"/>
-        </w:rPr>
-      </w:pPr>
-      <w:r>
-        <w:rPr>
-          <w:rFonts w:ascii="Times New Roman" w:hAnsi="Times New Roman" w:cs="Times New Roman"/>
-          <w:sz w:val="28"/>
-          <w:szCs w:val="28"/>
-        </w:rPr>
-        <w:t xml:space="preserve">Câu 94. Kiểm tra lại ứng dụng sau khi khởi động lại các Container. (Gợi ý: Sử dụng docker compose ps và truy cập Frontend bằng trình duyệt.) </w:t>
-      </w:r>
-    </w:p>
-    <w:p>
-      <w:pPr>
-        <w:rPr>
-          <w:rFonts w:ascii="Times New Roman" w:hAnsi="Times New Roman" w:cs="Times New Roman"/>
-          <w:sz w:val="28"/>
-          <w:szCs w:val="28"/>
-        </w:rPr>
-      </w:pPr>
-      <w:r>
-        <w:rPr>
-          <w:rFonts w:ascii="Times New Roman" w:hAnsi="Times New Roman" w:cs="Times New Roman"/>
-          <w:sz w:val="28"/>
-          <w:szCs w:val="28"/>
-        </w:rPr>
-        <w:t xml:space="preserve">Mục tiêu: Sinh viên sử dụng Docker Compose để xây dựng và quản lý đồng thời Frontend </w:t>
-      </w:r>
-    </w:p>
-    <w:p>
-      <w:pPr>
-        <w:rPr>
-          <w:rFonts w:ascii="Times New Roman" w:hAnsi="Times New Roman" w:cs="Times New Roman"/>
-          <w:sz w:val="28"/>
-          <w:szCs w:val="28"/>
-        </w:rPr>
-      </w:pPr>
-      <w:r>
-        <w:rPr>
-          <w:rFonts w:ascii="Times New Roman" w:hAnsi="Times New Roman" w:cs="Times New Roman"/>
-          <w:sz w:val="28"/>
-          <w:szCs w:val="28"/>
-        </w:rPr>
-        <w:t xml:space="preserve">Container và Backend Container. </w:t>
+        <w:t>PHẦN 6. DOCKER COMPOSE CHO ỨNG</w:t>
       </w:r>
     </w:p>
     <w:p>
@@ -769,18 +1321,324 @@
           <w:sz w:val="28"/>
           <w:szCs w:val="28"/>
         </w:rPr>
-        <w:t>PHẦN 7. GIT VÀ HOÀN THÀNH BÀI</w:t>
+        <w:t>DỤNG MERN</w:t>
+      </w:r>
+    </w:p>
+    <w:p>
+      <w:pPr>
+        <w:rPr>
+          <w:rFonts w:ascii="Times New Roman" w:hAnsi="Times New Roman" w:cs="Times New Roman"/>
+          <w:sz w:val="28"/>
+          <w:szCs w:val="28"/>
+          <w:lang w:val="vi-VN"/>
+        </w:rPr>
+      </w:pPr>
+      <w:r>
+        <w:rPr>
+          <w:rFonts w:ascii="Times New Roman" w:hAnsi="Times New Roman" w:cs="Times New Roman"/>
+          <w:sz w:val="28"/>
+          <w:szCs w:val="28"/>
+        </w:rPr>
+        <w:t xml:space="preserve">Câu 79. Dừng các Container Backend và Frontend đang chạy. (Gợi ý lệnh: docker stop ...) </w:t>
+      </w:r>
+    </w:p>
+    <w:p>
+      <w:pPr>
+        <w:rPr>
+          <w:rFonts w:ascii="Times New Roman" w:hAnsi="Times New Roman" w:cs="Times New Roman"/>
+          <w:sz w:val="28"/>
+          <w:szCs w:val="28"/>
+          <w:lang w:val="vi-VN"/>
+        </w:rPr>
+      </w:pPr>
+      <w:r>
+        <w:rPr>
+          <w:rFonts w:ascii="Times New Roman" w:hAnsi="Times New Roman" w:cs="Times New Roman"/>
+          <w:sz w:val="28"/>
+          <w:szCs w:val="28"/>
+          <w:lang w:val="vi-VN"/>
+        </w:rPr>
+        <w:drawing>
+          <wp:inline distT="0" distB="0" distL="0" distR="0" wp14:anchorId="2608C169" wp14:editId="7C1805D3">
+            <wp:extent cx="5760720" cy="965835"/>
+            <wp:effectExtent l="0" t="0" r="0" b="5715"/>
+            <wp:docPr id="1456976011" name="Picture 1"/>
+            <wp:cNvGraphicFramePr>
+              <a:graphicFrameLocks xmlns:a="http://schemas.openxmlformats.org/drawingml/2006/main" noChangeAspect="1"/>
+            </wp:cNvGraphicFramePr>
+            <a:graphic xmlns:a="http://schemas.openxmlformats.org/drawingml/2006/main">
+              <a:graphicData uri="http://schemas.openxmlformats.org/drawingml/2006/picture">
+                <pic:pic xmlns:pic="http://schemas.openxmlformats.org/drawingml/2006/picture">
+                  <pic:nvPicPr>
+                    <pic:cNvPr id="1456976011" name=""/>
+                    <pic:cNvPicPr/>
+                  </pic:nvPicPr>
+                  <pic:blipFill>
+                    <a:blip r:embed="rId21"/>
+                    <a:stretch>
+                      <a:fillRect/>
+                    </a:stretch>
+                  </pic:blipFill>
+                  <pic:spPr>
+                    <a:xfrm>
+                      <a:off x="0" y="0"/>
+                      <a:ext cx="5760720" cy="965835"/>
+                    </a:xfrm>
+                    <a:prstGeom prst="rect">
+                      <a:avLst/>
+                    </a:prstGeom>
+                  </pic:spPr>
+                </pic:pic>
+              </a:graphicData>
+            </a:graphic>
+          </wp:inline>
+        </w:drawing>
+      </w:r>
+    </w:p>
+    <w:p>
+      <w:pPr>
+        <w:rPr>
+          <w:rFonts w:ascii="Times New Roman" w:hAnsi="Times New Roman" w:cs="Times New Roman"/>
+          <w:sz w:val="28"/>
+          <w:szCs w:val="28"/>
+          <w:lang w:val="vi-VN"/>
+        </w:rPr>
+      </w:pPr>
+      <w:r>
+        <w:rPr>
+          <w:rFonts w:ascii="Times New Roman" w:hAnsi="Times New Roman" w:cs="Times New Roman"/>
+          <w:sz w:val="28"/>
+          <w:szCs w:val="28"/>
+        </w:rPr>
+        <w:t xml:space="preserve">Câu 80. Tạo file docker-compose.yml tại thư mục gốc của Repository. (Gợi ý lệnh: touch docker-compose.yml) </w:t>
+      </w:r>
+    </w:p>
+    <w:p>
+      <w:pPr>
+        <w:rPr>
+          <w:rFonts w:ascii="Times New Roman" w:hAnsi="Times New Roman" w:cs="Times New Roman"/>
+          <w:sz w:val="28"/>
+          <w:szCs w:val="28"/>
+          <w:lang w:val="vi-VN"/>
+        </w:rPr>
+      </w:pPr>
+      <w:r>
+        <w:rPr>
+          <w:rFonts w:ascii="Times New Roman" w:hAnsi="Times New Roman" w:cs="Times New Roman"/>
+          <w:sz w:val="28"/>
+          <w:szCs w:val="28"/>
+          <w:lang w:val="vi-VN"/>
+        </w:rPr>
+        <w:lastRenderedPageBreak/>
+        <w:drawing>
+          <wp:inline distT="0" distB="0" distL="0" distR="0" wp14:anchorId="1C0796AD" wp14:editId="6A1566CF">
+            <wp:extent cx="5760720" cy="2244725"/>
+            <wp:effectExtent l="0" t="0" r="0" b="3175"/>
+            <wp:docPr id="1837522007" name="Picture 1"/>
+            <wp:cNvGraphicFramePr>
+              <a:graphicFrameLocks xmlns:a="http://schemas.openxmlformats.org/drawingml/2006/main" noChangeAspect="1"/>
+            </wp:cNvGraphicFramePr>
+            <a:graphic xmlns:a="http://schemas.openxmlformats.org/drawingml/2006/main">
+              <a:graphicData uri="http://schemas.openxmlformats.org/drawingml/2006/picture">
+                <pic:pic xmlns:pic="http://schemas.openxmlformats.org/drawingml/2006/picture">
+                  <pic:nvPicPr>
+                    <pic:cNvPr id="1837522007" name=""/>
+                    <pic:cNvPicPr/>
+                  </pic:nvPicPr>
+                  <pic:blipFill>
+                    <a:blip r:embed="rId22"/>
+                    <a:stretch>
+                      <a:fillRect/>
+                    </a:stretch>
+                  </pic:blipFill>
+                  <pic:spPr>
+                    <a:xfrm>
+                      <a:off x="0" y="0"/>
+                      <a:ext cx="5760720" cy="2244725"/>
+                    </a:xfrm>
+                    <a:prstGeom prst="rect">
+                      <a:avLst/>
+                    </a:prstGeom>
+                  </pic:spPr>
+                </pic:pic>
+              </a:graphicData>
+            </a:graphic>
+          </wp:inline>
+        </w:drawing>
+      </w:r>
+    </w:p>
+    <w:p>
+      <w:pPr>
+        <w:rPr>
+          <w:rFonts w:ascii="Times New Roman" w:hAnsi="Times New Roman" w:cs="Times New Roman"/>
+          <w:sz w:val="28"/>
+          <w:szCs w:val="28"/>
+          <w:lang w:val="vi-VN"/>
+        </w:rPr>
+      </w:pPr>
+      <w:r>
+        <w:rPr>
+          <w:rFonts w:ascii="Times New Roman" w:hAnsi="Times New Roman" w:cs="Times New Roman"/>
+          <w:sz w:val="28"/>
+          <w:szCs w:val="28"/>
+        </w:rPr>
+        <w:t xml:space="preserve">Câu 81. Khai báo Service backend trong Docker Compose. (Gợi ý: Sử dụng thuộc tính services và build.) </w:t>
       </w:r>
     </w:p>
     <w:p>
       <w:pPr>
         <w:jc w:val="center"/>
+        <w:rPr>
+          <w:rFonts w:ascii="Times New Roman" w:hAnsi="Times New Roman" w:cs="Times New Roman"/>
+          <w:sz w:val="28"/>
+          <w:szCs w:val="28"/>
+          <w:lang w:val="vi-VN"/>
+        </w:rPr>
+      </w:pPr>
+      <w:r>
+        <w:rPr>
+          <w:rFonts w:ascii="Times New Roman" w:hAnsi="Times New Roman" w:cs="Times New Roman"/>
+          <w:sz w:val="28"/>
+          <w:szCs w:val="28"/>
+          <w:lang w:val="vi-VN"/>
+        </w:rPr>
+        <w:drawing>
+          <wp:inline distT="0" distB="0" distL="0" distR="0" wp14:anchorId="076FBB47" wp14:editId="647039E7">
+            <wp:extent cx="4686954" cy="2876951"/>
+            <wp:effectExtent l="0" t="0" r="0" b="0"/>
+            <wp:docPr id="813240256" name="Picture 1"/>
+            <wp:cNvGraphicFramePr>
+              <a:graphicFrameLocks xmlns:a="http://schemas.openxmlformats.org/drawingml/2006/main" noChangeAspect="1"/>
+            </wp:cNvGraphicFramePr>
+            <a:graphic xmlns:a="http://schemas.openxmlformats.org/drawingml/2006/main">
+              <a:graphicData uri="http://schemas.openxmlformats.org/drawingml/2006/picture">
+                <pic:pic xmlns:pic="http://schemas.openxmlformats.org/drawingml/2006/picture">
+                  <pic:nvPicPr>
+                    <pic:cNvPr id="813240256" name=""/>
+                    <pic:cNvPicPr/>
+                  </pic:nvPicPr>
+                  <pic:blipFill>
+                    <a:blip r:embed="rId23"/>
+                    <a:stretch>
+                      <a:fillRect/>
+                    </a:stretch>
+                  </pic:blipFill>
+                  <pic:spPr>
+                    <a:xfrm>
+                      <a:off x="0" y="0"/>
+                      <a:ext cx="4686954" cy="2876951"/>
+                    </a:xfrm>
+                    <a:prstGeom prst="rect">
+                      <a:avLst/>
+                    </a:prstGeom>
+                  </pic:spPr>
+                </pic:pic>
+              </a:graphicData>
+            </a:graphic>
+          </wp:inline>
+        </w:drawing>
+      </w:r>
+    </w:p>
+    <w:p>
+      <w:pPr>
+        <w:rPr>
+          <w:rFonts w:ascii="Times New Roman" w:hAnsi="Times New Roman" w:cs="Times New Roman"/>
+          <w:sz w:val="28"/>
+          <w:szCs w:val="28"/>
+        </w:rPr>
+      </w:pPr>
+      <w:r>
+        <w:rPr>
+          <w:rFonts w:ascii="Times New Roman" w:hAnsi="Times New Roman" w:cs="Times New Roman"/>
+          <w:sz w:val="28"/>
+          <w:szCs w:val="28"/>
+        </w:rPr>
+        <w:t xml:space="preserve">Câu 82. Khai báo Service frontend trong Docker Compose. (Gợi ý: Sử dụng thuộc tính services và build.) </w:t>
+      </w:r>
+    </w:p>
+    <w:p>
+      <w:pPr>
+        <w:jc w:val="center"/>
+        <w:rPr>
+          <w:rFonts w:ascii="Times New Roman" w:hAnsi="Times New Roman" w:cs="Times New Roman"/>
+          <w:sz w:val="28"/>
+          <w:szCs w:val="28"/>
+          <w:lang w:val="vi-VN"/>
+        </w:rPr>
+      </w:pPr>
+      <w:r>
         <w:rPr>
           <w:rFonts w:ascii="Times New Roman" w:hAnsi="Times New Roman" w:cs="Times New Roman"/>
           <w:b/>
           <w:bCs/>
           <w:sz w:val="28"/>
           <w:szCs w:val="28"/>
+          <w:lang w:val="vi-VN"/>
+        </w:rPr>
+        <w:lastRenderedPageBreak/>
+        <w:drawing>
+          <wp:inline distT="0" distB="0" distL="0" distR="0" wp14:anchorId="0CD9D7E3" wp14:editId="1C3BCD66">
+            <wp:extent cx="5210902" cy="4505954"/>
+            <wp:effectExtent l="0" t="0" r="8890" b="9525"/>
+            <wp:docPr id="691314034" name="Picture 1"/>
+            <wp:cNvGraphicFramePr>
+              <a:graphicFrameLocks xmlns:a="http://schemas.openxmlformats.org/drawingml/2006/main" noChangeAspect="1"/>
+            </wp:cNvGraphicFramePr>
+            <a:graphic xmlns:a="http://schemas.openxmlformats.org/drawingml/2006/main">
+              <a:graphicData uri="http://schemas.openxmlformats.org/drawingml/2006/picture">
+                <pic:pic xmlns:pic="http://schemas.openxmlformats.org/drawingml/2006/picture">
+                  <pic:nvPicPr>
+                    <pic:cNvPr id="691314034" name=""/>
+                    <pic:cNvPicPr/>
+                  </pic:nvPicPr>
+                  <pic:blipFill>
+                    <a:blip r:embed="rId24"/>
+                    <a:stretch>
+                      <a:fillRect/>
+                    </a:stretch>
+                  </pic:blipFill>
+                  <pic:spPr>
+                    <a:xfrm>
+                      <a:off x="0" y="0"/>
+                      <a:ext cx="5210902" cy="4505954"/>
+                    </a:xfrm>
+                    <a:prstGeom prst="rect">
+                      <a:avLst/>
+                    </a:prstGeom>
+                  </pic:spPr>
+                </pic:pic>
+              </a:graphicData>
+            </a:graphic>
+          </wp:inline>
+        </w:drawing>
+      </w:r>
+    </w:p>
+    <w:p>
+      <w:pPr>
+        <w:rPr>
+          <w:rFonts w:ascii="Times New Roman" w:hAnsi="Times New Roman" w:cs="Times New Roman"/>
+          <w:sz w:val="28"/>
+          <w:szCs w:val="28"/>
+          <w:lang w:val="vi-VN"/>
+        </w:rPr>
+      </w:pPr>
+      <w:r>
+        <w:rPr>
+          <w:rFonts w:ascii="Times New Roman" w:hAnsi="Times New Roman" w:cs="Times New Roman"/>
+          <w:sz w:val="28"/>
+          <w:szCs w:val="28"/>
+        </w:rPr>
+        <w:t xml:space="preserve">Câu 83. Cấu hình Port cho Service backend. (Gợi ý: Ánh xạ port 5000 của Container ra port trên máy local.) </w:t>
+      </w:r>
+    </w:p>
+    <w:p>
+      <w:pPr>
+        <w:jc w:val="center"/>
+        <w:rPr>
+          <w:rFonts w:ascii="Times New Roman" w:hAnsi="Times New Roman" w:cs="Times New Roman"/>
+          <w:sz w:val="28"/>
+          <w:szCs w:val="28"/>
+          <w:lang w:val="vi-VN"/>
         </w:rPr>
       </w:pPr>
       <w:r>
@@ -790,110 +1648,1009 @@
           <w:bCs/>
           <w:sz w:val="28"/>
           <w:szCs w:val="28"/>
-        </w:rPr>
-        <w:t>THỰC HÀNH</w:t>
-      </w:r>
-    </w:p>
-    <w:p>
-      <w:pPr>
-        <w:rPr>
-          <w:rFonts w:ascii="Times New Roman" w:hAnsi="Times New Roman" w:cs="Times New Roman"/>
-          <w:sz w:val="28"/>
-          <w:szCs w:val="28"/>
-        </w:rPr>
-      </w:pPr>
-      <w:r>
-        <w:rPr>
-          <w:rFonts w:ascii="Times New Roman" w:hAnsi="Times New Roman" w:cs="Times New Roman"/>
-          <w:sz w:val="28"/>
-          <w:szCs w:val="28"/>
-        </w:rPr>
-        <w:t xml:space="preserve">Câu 95. Kiểm tra các file đã thay đổi sau khi hoàn thành Buổi 3. (Gợi ý lệnh: git status) </w:t>
-      </w:r>
-    </w:p>
-    <w:p>
-      <w:pPr>
-        <w:rPr>
-          <w:rFonts w:ascii="Times New Roman" w:hAnsi="Times New Roman" w:cs="Times New Roman"/>
-          <w:sz w:val="28"/>
-          <w:szCs w:val="28"/>
-        </w:rPr>
-      </w:pPr>
-      <w:r>
-        <w:rPr>
-          <w:rFonts w:ascii="Times New Roman" w:hAnsi="Times New Roman" w:cs="Times New Roman"/>
-          <w:sz w:val="28"/>
-          <w:szCs w:val="28"/>
-        </w:rPr>
-        <w:t xml:space="preserve">Câu 96. Kiểm tra .gitignore và đảm bảo file .env không được đưa vào Git. (Gợi ý lệnh: git status) </w:t>
-      </w:r>
-    </w:p>
-    <w:p>
-      <w:pPr>
-        <w:rPr>
-          <w:rFonts w:ascii="Times New Roman" w:hAnsi="Times New Roman" w:cs="Times New Roman"/>
-          <w:sz w:val="28"/>
-          <w:szCs w:val="28"/>
-        </w:rPr>
-      </w:pPr>
-      <w:r>
-        <w:rPr>
-          <w:rFonts w:ascii="Times New Roman" w:hAnsi="Times New Roman" w:cs="Times New Roman"/>
-          <w:sz w:val="28"/>
-          <w:szCs w:val="28"/>
-        </w:rPr>
-        <w:t xml:space="preserve">Câu 97. Kiểm tra các file Docker trước khi commit. (Gợi ý: Kiểm tra client/Dockerfile, server/Dockerfile và docker-compose.yml.) </w:t>
-      </w:r>
-    </w:p>
-    <w:p>
-      <w:pPr>
-        <w:rPr>
-          <w:rFonts w:ascii="Times New Roman" w:hAnsi="Times New Roman" w:cs="Times New Roman"/>
-          <w:sz w:val="28"/>
-          <w:szCs w:val="28"/>
-        </w:rPr>
-      </w:pPr>
-      <w:r>
-        <w:rPr>
-          <w:rFonts w:ascii="Times New Roman" w:hAnsi="Times New Roman" w:cs="Times New Roman"/>
-          <w:sz w:val="28"/>
-          <w:szCs w:val="28"/>
-        </w:rPr>
-        <w:t xml:space="preserve">Câu 98. Đưa source code và cấu hình Docker vào Staging Area. (Gợi ý lệnh: git add .) </w:t>
-      </w:r>
-    </w:p>
-    <w:p>
-      <w:pPr>
-        <w:rPr>
-          <w:rFonts w:ascii="Times New Roman" w:hAnsi="Times New Roman" w:cs="Times New Roman"/>
-          <w:sz w:val="28"/>
-          <w:szCs w:val="28"/>
-        </w:rPr>
-      </w:pPr>
-      <w:r>
-        <w:rPr>
-          <w:rFonts w:ascii="Times New Roman" w:hAnsi="Times New Roman" w:cs="Times New Roman"/>
-          <w:sz w:val="28"/>
-          <w:szCs w:val="28"/>
-        </w:rPr>
-        <w:t xml:space="preserve">Câu 99. Tạo commit cho kết quả thực hành Buổi 3. (Gợi ý lệnh: git commit -m "Complete Lab 03 Docker MERN") </w:t>
-      </w:r>
-    </w:p>
-    <w:p>
-      <w:pPr>
-        <w:rPr>
-          <w:rFonts w:ascii="Times New Roman" w:hAnsi="Times New Roman" w:cs="Times New Roman"/>
-          <w:sz w:val="28"/>
-          <w:szCs w:val="28"/>
-        </w:rPr>
-      </w:pPr>
-      <w:r>
-        <w:rPr>
-          <w:rFonts w:ascii="Times New Roman" w:hAnsi="Times New Roman" w:cs="Times New Roman"/>
-          <w:sz w:val="28"/>
-          <w:szCs w:val="28"/>
-        </w:rPr>
-        <w:t xml:space="preserve">Câu 100. Push source code lên GitHub. (Gợi ý lệnh: git push) </w:t>
+          <w:lang w:val="vi-VN"/>
+        </w:rPr>
+        <w:lastRenderedPageBreak/>
+        <w:drawing>
+          <wp:inline distT="0" distB="0" distL="0" distR="0" wp14:anchorId="6E645720" wp14:editId="1A6F4FC1">
+            <wp:extent cx="5210902" cy="4505954"/>
+            <wp:effectExtent l="0" t="0" r="8890" b="9525"/>
+            <wp:docPr id="617625076" name="Picture 1"/>
+            <wp:cNvGraphicFramePr>
+              <a:graphicFrameLocks xmlns:a="http://schemas.openxmlformats.org/drawingml/2006/main" noChangeAspect="1"/>
+            </wp:cNvGraphicFramePr>
+            <a:graphic xmlns:a="http://schemas.openxmlformats.org/drawingml/2006/main">
+              <a:graphicData uri="http://schemas.openxmlformats.org/drawingml/2006/picture">
+                <pic:pic xmlns:pic="http://schemas.openxmlformats.org/drawingml/2006/picture">
+                  <pic:nvPicPr>
+                    <pic:cNvPr id="691314034" name=""/>
+                    <pic:cNvPicPr/>
+                  </pic:nvPicPr>
+                  <pic:blipFill>
+                    <a:blip r:embed="rId24"/>
+                    <a:stretch>
+                      <a:fillRect/>
+                    </a:stretch>
+                  </pic:blipFill>
+                  <pic:spPr>
+                    <a:xfrm>
+                      <a:off x="0" y="0"/>
+                      <a:ext cx="5210902" cy="4505954"/>
+                    </a:xfrm>
+                    <a:prstGeom prst="rect">
+                      <a:avLst/>
+                    </a:prstGeom>
+                  </pic:spPr>
+                </pic:pic>
+              </a:graphicData>
+            </a:graphic>
+          </wp:inline>
+        </w:drawing>
+      </w:r>
+    </w:p>
+    <w:p>
+      <w:pPr>
+        <w:rPr>
+          <w:rFonts w:ascii="Times New Roman" w:hAnsi="Times New Roman" w:cs="Times New Roman"/>
+          <w:sz w:val="28"/>
+          <w:szCs w:val="28"/>
+          <w:lang w:val="vi-VN"/>
+        </w:rPr>
+      </w:pPr>
+      <w:r>
+        <w:rPr>
+          <w:rFonts w:ascii="Times New Roman" w:hAnsi="Times New Roman" w:cs="Times New Roman"/>
+          <w:sz w:val="28"/>
+          <w:szCs w:val="28"/>
+        </w:rPr>
+        <w:t xml:space="preserve">Câu 84. Cấu hình Port cho Service frontend. (Gợi ý: Ánh xạ port của Frontend Container ra port trên máy local.) </w:t>
+      </w:r>
+    </w:p>
+    <w:p>
+      <w:pPr>
+        <w:jc w:val="center"/>
+        <w:rPr>
+          <w:rFonts w:ascii="Times New Roman" w:hAnsi="Times New Roman" w:cs="Times New Roman"/>
+          <w:sz w:val="28"/>
+          <w:szCs w:val="28"/>
+          <w:lang w:val="vi-VN"/>
+        </w:rPr>
+      </w:pPr>
+      <w:r>
+        <w:rPr>
+          <w:rFonts w:ascii="Times New Roman" w:hAnsi="Times New Roman" w:cs="Times New Roman"/>
+          <w:sz w:val="28"/>
+          <w:szCs w:val="28"/>
+          <w:lang w:val="vi-VN"/>
+        </w:rPr>
+        <w:lastRenderedPageBreak/>
+        <w:drawing>
+          <wp:inline distT="0" distB="0" distL="0" distR="0" wp14:anchorId="1ACBE763" wp14:editId="1B7889B9">
+            <wp:extent cx="5210902" cy="4401164"/>
+            <wp:effectExtent l="0" t="0" r="8890" b="0"/>
+            <wp:docPr id="909067175" name="Picture 1"/>
+            <wp:cNvGraphicFramePr>
+              <a:graphicFrameLocks xmlns:a="http://schemas.openxmlformats.org/drawingml/2006/main" noChangeAspect="1"/>
+            </wp:cNvGraphicFramePr>
+            <a:graphic xmlns:a="http://schemas.openxmlformats.org/drawingml/2006/main">
+              <a:graphicData uri="http://schemas.openxmlformats.org/drawingml/2006/picture">
+                <pic:pic xmlns:pic="http://schemas.openxmlformats.org/drawingml/2006/picture">
+                  <pic:nvPicPr>
+                    <pic:cNvPr id="909067175" name=""/>
+                    <pic:cNvPicPr/>
+                  </pic:nvPicPr>
+                  <pic:blipFill>
+                    <a:blip r:embed="rId25"/>
+                    <a:stretch>
+                      <a:fillRect/>
+                    </a:stretch>
+                  </pic:blipFill>
+                  <pic:spPr>
+                    <a:xfrm>
+                      <a:off x="0" y="0"/>
+                      <a:ext cx="5210902" cy="4401164"/>
+                    </a:xfrm>
+                    <a:prstGeom prst="rect">
+                      <a:avLst/>
+                    </a:prstGeom>
+                  </pic:spPr>
+                </pic:pic>
+              </a:graphicData>
+            </a:graphic>
+          </wp:inline>
+        </w:drawing>
+      </w:r>
+    </w:p>
+    <w:p>
+      <w:pPr>
+        <w:rPr>
+          <w:rFonts w:ascii="Times New Roman" w:hAnsi="Times New Roman" w:cs="Times New Roman"/>
+          <w:sz w:val="28"/>
+          <w:szCs w:val="28"/>
+          <w:lang w:val="vi-VN"/>
+        </w:rPr>
+      </w:pPr>
+      <w:r>
+        <w:rPr>
+          <w:rFonts w:ascii="Times New Roman" w:hAnsi="Times New Roman" w:cs="Times New Roman"/>
+          <w:sz w:val="28"/>
+          <w:szCs w:val="28"/>
+        </w:rPr>
+        <w:t xml:space="preserve">Câu 85. Cấu hình biến môi trường MONGODB_URI cho Backend trong Docker Compose. (Gợi ý: Sử dụng thuộc tính environment.) </w:t>
+      </w:r>
+    </w:p>
+    <w:p>
+      <w:pPr>
+        <w:rPr>
+          <w:rFonts w:ascii="Times New Roman" w:hAnsi="Times New Roman" w:cs="Times New Roman"/>
+          <w:sz w:val="28"/>
+          <w:szCs w:val="28"/>
+          <w:lang w:val="vi-VN"/>
+        </w:rPr>
+      </w:pPr>
+      <w:r>
+        <w:rPr>
+          <w:rFonts w:ascii="Times New Roman" w:hAnsi="Times New Roman" w:cs="Times New Roman"/>
+          <w:sz w:val="28"/>
+          <w:szCs w:val="28"/>
+          <w:lang w:val="vi-VN"/>
+        </w:rPr>
+        <w:drawing>
+          <wp:inline distT="0" distB="0" distL="0" distR="0" wp14:anchorId="74F3E3A3" wp14:editId="0364A961">
+            <wp:extent cx="5760720" cy="2877820"/>
+            <wp:effectExtent l="0" t="0" r="0" b="0"/>
+            <wp:docPr id="638491393" name="Picture 1"/>
+            <wp:cNvGraphicFramePr>
+              <a:graphicFrameLocks xmlns:a="http://schemas.openxmlformats.org/drawingml/2006/main" noChangeAspect="1"/>
+            </wp:cNvGraphicFramePr>
+            <a:graphic xmlns:a="http://schemas.openxmlformats.org/drawingml/2006/main">
+              <a:graphicData uri="http://schemas.openxmlformats.org/drawingml/2006/picture">
+                <pic:pic xmlns:pic="http://schemas.openxmlformats.org/drawingml/2006/picture">
+                  <pic:nvPicPr>
+                    <pic:cNvPr id="638491393" name=""/>
+                    <pic:cNvPicPr/>
+                  </pic:nvPicPr>
+                  <pic:blipFill>
+                    <a:blip r:embed="rId26"/>
+                    <a:stretch>
+                      <a:fillRect/>
+                    </a:stretch>
+                  </pic:blipFill>
+                  <pic:spPr>
+                    <a:xfrm>
+                      <a:off x="0" y="0"/>
+                      <a:ext cx="5760720" cy="2877820"/>
+                    </a:xfrm>
+                    <a:prstGeom prst="rect">
+                      <a:avLst/>
+                    </a:prstGeom>
+                  </pic:spPr>
+                </pic:pic>
+              </a:graphicData>
+            </a:graphic>
+          </wp:inline>
+        </w:drawing>
+      </w:r>
+    </w:p>
+    <w:p>
+      <w:pPr>
+        <w:rPr>
+          <w:rFonts w:ascii="Times New Roman" w:hAnsi="Times New Roman" w:cs="Times New Roman"/>
+          <w:sz w:val="28"/>
+          <w:szCs w:val="28"/>
+          <w:lang w:val="vi-VN"/>
+        </w:rPr>
+      </w:pPr>
+      <w:r>
+        <w:rPr>
+          <w:rFonts w:ascii="Times New Roman" w:hAnsi="Times New Roman" w:cs="Times New Roman"/>
+          <w:sz w:val="28"/>
+          <w:szCs w:val="28"/>
+        </w:rPr>
+        <w:t>Câu 86. Khởi động toàn bộ ứng dụng MERN bằng Docker Compose. (Gợi ý lệnh: docker compose up -d --build)</w:t>
+      </w:r>
+    </w:p>
+    <w:p>
+      <w:pPr>
+        <w:rPr>
+          <w:rFonts w:ascii="Times New Roman" w:hAnsi="Times New Roman" w:cs="Times New Roman"/>
+          <w:sz w:val="28"/>
+          <w:szCs w:val="28"/>
+        </w:rPr>
+      </w:pPr>
+      <w:r>
+        <w:rPr>
+          <w:rFonts w:ascii="Times New Roman" w:hAnsi="Times New Roman" w:cs="Times New Roman"/>
+          <w:sz w:val="28"/>
+          <w:szCs w:val="28"/>
+        </w:rPr>
+        <w:lastRenderedPageBreak/>
+        <w:drawing>
+          <wp:inline distT="0" distB="0" distL="0" distR="0" wp14:anchorId="5940DC38" wp14:editId="284D4861">
+            <wp:extent cx="5744377" cy="1648055"/>
+            <wp:effectExtent l="0" t="0" r="8890" b="9525"/>
+            <wp:docPr id="287967185" name="Picture 1"/>
+            <wp:cNvGraphicFramePr>
+              <a:graphicFrameLocks xmlns:a="http://schemas.openxmlformats.org/drawingml/2006/main" noChangeAspect="1"/>
+            </wp:cNvGraphicFramePr>
+            <a:graphic xmlns:a="http://schemas.openxmlformats.org/drawingml/2006/main">
+              <a:graphicData uri="http://schemas.openxmlformats.org/drawingml/2006/picture">
+                <pic:pic xmlns:pic="http://schemas.openxmlformats.org/drawingml/2006/picture">
+                  <pic:nvPicPr>
+                    <pic:cNvPr id="287967185" name=""/>
+                    <pic:cNvPicPr/>
+                  </pic:nvPicPr>
+                  <pic:blipFill>
+                    <a:blip r:embed="rId27"/>
+                    <a:stretch>
+                      <a:fillRect/>
+                    </a:stretch>
+                  </pic:blipFill>
+                  <pic:spPr>
+                    <a:xfrm>
+                      <a:off x="0" y="0"/>
+                      <a:ext cx="5744377" cy="1648055"/>
+                    </a:xfrm>
+                    <a:prstGeom prst="rect">
+                      <a:avLst/>
+                    </a:prstGeom>
+                  </pic:spPr>
+                </pic:pic>
+              </a:graphicData>
+            </a:graphic>
+          </wp:inline>
+        </w:drawing>
+      </w:r>
+      <w:r>
+        <w:rPr>
+          <w:rFonts w:ascii="Times New Roman" w:hAnsi="Times New Roman" w:cs="Times New Roman"/>
+          <w:sz w:val="28"/>
+          <w:szCs w:val="28"/>
+        </w:rPr>
+        <w:t xml:space="preserve"> </w:t>
+      </w:r>
+    </w:p>
+    <w:p>
+      <w:pPr>
+        <w:rPr>
+          <w:rFonts w:ascii="Times New Roman" w:hAnsi="Times New Roman" w:cs="Times New Roman"/>
+          <w:sz w:val="28"/>
+          <w:szCs w:val="28"/>
+          <w:lang w:val="vi-VN"/>
+        </w:rPr>
+      </w:pPr>
+      <w:r>
+        <w:rPr>
+          <w:rFonts w:ascii="Times New Roman" w:hAnsi="Times New Roman" w:cs="Times New Roman"/>
+          <w:sz w:val="28"/>
+          <w:szCs w:val="28"/>
+        </w:rPr>
+        <w:t xml:space="preserve">Câu 87. Kiểm tra trạng thái các Service đang chạy. (Gợi ý lệnh: docker compose ps) </w:t>
+      </w:r>
+    </w:p>
+    <w:p>
+      <w:pPr>
+        <w:rPr>
+          <w:rFonts w:ascii="Times New Roman" w:hAnsi="Times New Roman" w:cs="Times New Roman"/>
+          <w:sz w:val="28"/>
+          <w:szCs w:val="28"/>
+          <w:lang w:val="vi-VN"/>
+        </w:rPr>
+      </w:pPr>
+      <w:r>
+        <w:rPr>
+          <w:rFonts w:ascii="Times New Roman" w:hAnsi="Times New Roman" w:cs="Times New Roman"/>
+          <w:sz w:val="28"/>
+          <w:szCs w:val="28"/>
+          <w:lang w:val="vi-VN"/>
+        </w:rPr>
+        <w:drawing>
+          <wp:inline distT="0" distB="0" distL="0" distR="0" wp14:anchorId="7F5D2C6D" wp14:editId="5D0E6F9B">
+            <wp:extent cx="5760720" cy="584835"/>
+            <wp:effectExtent l="0" t="0" r="0" b="5715"/>
+            <wp:docPr id="1367953080" name="Picture 1"/>
+            <wp:cNvGraphicFramePr>
+              <a:graphicFrameLocks xmlns:a="http://schemas.openxmlformats.org/drawingml/2006/main" noChangeAspect="1"/>
+            </wp:cNvGraphicFramePr>
+            <a:graphic xmlns:a="http://schemas.openxmlformats.org/drawingml/2006/main">
+              <a:graphicData uri="http://schemas.openxmlformats.org/drawingml/2006/picture">
+                <pic:pic xmlns:pic="http://schemas.openxmlformats.org/drawingml/2006/picture">
+                  <pic:nvPicPr>
+                    <pic:cNvPr id="1367953080" name=""/>
+                    <pic:cNvPicPr/>
+                  </pic:nvPicPr>
+                  <pic:blipFill>
+                    <a:blip r:embed="rId28"/>
+                    <a:stretch>
+                      <a:fillRect/>
+                    </a:stretch>
+                  </pic:blipFill>
+                  <pic:spPr>
+                    <a:xfrm>
+                      <a:off x="0" y="0"/>
+                      <a:ext cx="5760720" cy="584835"/>
+                    </a:xfrm>
+                    <a:prstGeom prst="rect">
+                      <a:avLst/>
+                    </a:prstGeom>
+                  </pic:spPr>
+                </pic:pic>
+              </a:graphicData>
+            </a:graphic>
+          </wp:inline>
+        </w:drawing>
+      </w:r>
+    </w:p>
+    <w:p>
+      <w:pPr>
+        <w:rPr>
+          <w:rFonts w:ascii="Times New Roman" w:hAnsi="Times New Roman" w:cs="Times New Roman"/>
+          <w:sz w:val="28"/>
+          <w:szCs w:val="28"/>
+          <w:lang w:val="vi-VN"/>
+        </w:rPr>
+      </w:pPr>
+      <w:r>
+        <w:rPr>
+          <w:rFonts w:ascii="Times New Roman" w:hAnsi="Times New Roman" w:cs="Times New Roman"/>
+          <w:sz w:val="28"/>
+          <w:szCs w:val="28"/>
+        </w:rPr>
+        <w:t xml:space="preserve">Câu 88. Xem log của Backend Service. (Gợi ý lệnh: docker compose logs backend) </w:t>
+      </w:r>
+    </w:p>
+    <w:p>
+      <w:pPr>
+        <w:rPr>
+          <w:rFonts w:ascii="Times New Roman" w:hAnsi="Times New Roman" w:cs="Times New Roman"/>
+          <w:sz w:val="28"/>
+          <w:szCs w:val="28"/>
+          <w:lang w:val="vi-VN"/>
+        </w:rPr>
+      </w:pPr>
+      <w:r>
+        <w:rPr>
+          <w:rFonts w:ascii="Times New Roman" w:hAnsi="Times New Roman" w:cs="Times New Roman"/>
+          <w:sz w:val="28"/>
+          <w:szCs w:val="28"/>
+          <w:lang w:val="vi-VN"/>
+        </w:rPr>
+        <w:drawing>
+          <wp:inline distT="0" distB="0" distL="0" distR="0" wp14:anchorId="4B60FEF5" wp14:editId="2D359113">
+            <wp:extent cx="5760720" cy="1360805"/>
+            <wp:effectExtent l="0" t="0" r="0" b="0"/>
+            <wp:docPr id="350174080" name="Picture 1"/>
+            <wp:cNvGraphicFramePr>
+              <a:graphicFrameLocks xmlns:a="http://schemas.openxmlformats.org/drawingml/2006/main" noChangeAspect="1"/>
+            </wp:cNvGraphicFramePr>
+            <a:graphic xmlns:a="http://schemas.openxmlformats.org/drawingml/2006/main">
+              <a:graphicData uri="http://schemas.openxmlformats.org/drawingml/2006/picture">
+                <pic:pic xmlns:pic="http://schemas.openxmlformats.org/drawingml/2006/picture">
+                  <pic:nvPicPr>
+                    <pic:cNvPr id="350174080" name=""/>
+                    <pic:cNvPicPr/>
+                  </pic:nvPicPr>
+                  <pic:blipFill>
+                    <a:blip r:embed="rId29"/>
+                    <a:stretch>
+                      <a:fillRect/>
+                    </a:stretch>
+                  </pic:blipFill>
+                  <pic:spPr>
+                    <a:xfrm>
+                      <a:off x="0" y="0"/>
+                      <a:ext cx="5760720" cy="1360805"/>
+                    </a:xfrm>
+                    <a:prstGeom prst="rect">
+                      <a:avLst/>
+                    </a:prstGeom>
+                  </pic:spPr>
+                </pic:pic>
+              </a:graphicData>
+            </a:graphic>
+          </wp:inline>
+        </w:drawing>
+      </w:r>
+    </w:p>
+    <w:p>
+      <w:pPr>
+        <w:rPr>
+          <w:rFonts w:ascii="Times New Roman" w:hAnsi="Times New Roman" w:cs="Times New Roman"/>
+          <w:sz w:val="28"/>
+          <w:szCs w:val="28"/>
+        </w:rPr>
+      </w:pPr>
+      <w:r>
+        <w:rPr>
+          <w:rFonts w:ascii="Times New Roman" w:hAnsi="Times New Roman" w:cs="Times New Roman"/>
+          <w:sz w:val="28"/>
+          <w:szCs w:val="28"/>
+        </w:rPr>
+        <w:t xml:space="preserve">Câu 89. Truy cập React Frontend bằng trình duyệt. (Gợi ý: Truy cập </w:t>
+      </w:r>
+    </w:p>
+    <w:p>
+      <w:pPr>
+        <w:rPr>
+          <w:rFonts w:ascii="Times New Roman" w:hAnsi="Times New Roman" w:cs="Times New Roman"/>
+          <w:sz w:val="28"/>
+          <w:szCs w:val="28"/>
+          <w:lang w:val="vi-VN"/>
+        </w:rPr>
+      </w:pPr>
+      <w:r>
+        <w:rPr>
+          <w:rFonts w:ascii="Times New Roman" w:hAnsi="Times New Roman" w:cs="Times New Roman"/>
+          <w:sz w:val="28"/>
+          <w:szCs w:val="28"/>
+        </w:rPr>
+        <w:t xml:space="preserve">http://localhost:&lt;port&gt;.) </w:t>
+      </w:r>
+    </w:p>
+    <w:p>
+      <w:pPr>
+        <w:rPr>
+          <w:rFonts w:ascii="Times New Roman" w:hAnsi="Times New Roman" w:cs="Times New Roman"/>
+          <w:sz w:val="28"/>
+          <w:szCs w:val="28"/>
+          <w:lang w:val="vi-VN"/>
+        </w:rPr>
+      </w:pPr>
+      <w:r>
+        <w:rPr>
+          <w:rFonts w:ascii="Times New Roman" w:hAnsi="Times New Roman" w:cs="Times New Roman"/>
+          <w:sz w:val="28"/>
+          <w:szCs w:val="28"/>
+          <w:lang w:val="vi-VN"/>
+        </w:rPr>
+        <w:lastRenderedPageBreak/>
+        <w:drawing>
+          <wp:inline distT="0" distB="0" distL="0" distR="0" wp14:anchorId="4457015A" wp14:editId="30AD590C">
+            <wp:extent cx="5760720" cy="3178175"/>
+            <wp:effectExtent l="0" t="0" r="0" b="3175"/>
+            <wp:docPr id="1138301910" name="Picture 1"/>
+            <wp:cNvGraphicFramePr>
+              <a:graphicFrameLocks xmlns:a="http://schemas.openxmlformats.org/drawingml/2006/main" noChangeAspect="1"/>
+            </wp:cNvGraphicFramePr>
+            <a:graphic xmlns:a="http://schemas.openxmlformats.org/drawingml/2006/main">
+              <a:graphicData uri="http://schemas.openxmlformats.org/drawingml/2006/picture">
+                <pic:pic xmlns:pic="http://schemas.openxmlformats.org/drawingml/2006/picture">
+                  <pic:nvPicPr>
+                    <pic:cNvPr id="1138301910" name=""/>
+                    <pic:cNvPicPr/>
+                  </pic:nvPicPr>
+                  <pic:blipFill>
+                    <a:blip r:embed="rId30"/>
+                    <a:stretch>
+                      <a:fillRect/>
+                    </a:stretch>
+                  </pic:blipFill>
+                  <pic:spPr>
+                    <a:xfrm>
+                      <a:off x="0" y="0"/>
+                      <a:ext cx="5760720" cy="3178175"/>
+                    </a:xfrm>
+                    <a:prstGeom prst="rect">
+                      <a:avLst/>
+                    </a:prstGeom>
+                  </pic:spPr>
+                </pic:pic>
+              </a:graphicData>
+            </a:graphic>
+          </wp:inline>
+        </w:drawing>
+      </w:r>
+    </w:p>
+    <w:p>
+      <w:pPr>
+        <w:rPr>
+          <w:rFonts w:ascii="Times New Roman" w:hAnsi="Times New Roman" w:cs="Times New Roman"/>
+          <w:sz w:val="28"/>
+          <w:szCs w:val="28"/>
+          <w:lang w:val="vi-VN"/>
+        </w:rPr>
+      </w:pPr>
+      <w:r>
+        <w:rPr>
+          <w:rFonts w:ascii="Times New Roman" w:hAnsi="Times New Roman" w:cs="Times New Roman"/>
+          <w:sz w:val="28"/>
+          <w:szCs w:val="28"/>
+        </w:rPr>
+        <w:t xml:space="preserve">Câu 90. Kiểm tra chức năng lấy danh sách sinh viên từ MongoDB Atlas. (Gợi ý: Kiểm tra luồng React → Backend → MongoDB Atlas.) </w:t>
+      </w:r>
+    </w:p>
+    <w:p>
+      <w:pPr>
+        <w:rPr>
+          <w:rFonts w:ascii="Times New Roman" w:hAnsi="Times New Roman" w:cs="Times New Roman"/>
+          <w:sz w:val="28"/>
+          <w:szCs w:val="28"/>
+          <w:lang w:val="vi-VN"/>
+        </w:rPr>
+      </w:pPr>
+      <w:r>
+        <w:rPr>
+          <w:rFonts w:ascii="Times New Roman" w:hAnsi="Times New Roman" w:cs="Times New Roman"/>
+          <w:sz w:val="28"/>
+          <w:szCs w:val="28"/>
+          <w:lang w:val="vi-VN"/>
+        </w:rPr>
+        <w:drawing>
+          <wp:inline distT="0" distB="0" distL="0" distR="0" wp14:anchorId="1B0115FC" wp14:editId="48CD84EA">
+            <wp:extent cx="5760720" cy="442595"/>
+            <wp:effectExtent l="0" t="0" r="0" b="0"/>
+            <wp:docPr id="2063871124" name="Picture 1"/>
+            <wp:cNvGraphicFramePr>
+              <a:graphicFrameLocks xmlns:a="http://schemas.openxmlformats.org/drawingml/2006/main" noChangeAspect="1"/>
+            </wp:cNvGraphicFramePr>
+            <a:graphic xmlns:a="http://schemas.openxmlformats.org/drawingml/2006/main">
+              <a:graphicData uri="http://schemas.openxmlformats.org/drawingml/2006/picture">
+                <pic:pic xmlns:pic="http://schemas.openxmlformats.org/drawingml/2006/picture">
+                  <pic:nvPicPr>
+                    <pic:cNvPr id="2063871124" name=""/>
+                    <pic:cNvPicPr/>
+                  </pic:nvPicPr>
+                  <pic:blipFill>
+                    <a:blip r:embed="rId31"/>
+                    <a:stretch>
+                      <a:fillRect/>
+                    </a:stretch>
+                  </pic:blipFill>
+                  <pic:spPr>
+                    <a:xfrm>
+                      <a:off x="0" y="0"/>
+                      <a:ext cx="5760720" cy="442595"/>
+                    </a:xfrm>
+                    <a:prstGeom prst="rect">
+                      <a:avLst/>
+                    </a:prstGeom>
+                  </pic:spPr>
+                </pic:pic>
+              </a:graphicData>
+            </a:graphic>
+          </wp:inline>
+        </w:drawing>
+      </w:r>
+    </w:p>
+    <w:p>
+      <w:pPr>
+        <w:rPr>
+          <w:rFonts w:ascii="Times New Roman" w:hAnsi="Times New Roman" w:cs="Times New Roman"/>
+          <w:sz w:val="28"/>
+          <w:szCs w:val="28"/>
+          <w:lang w:val="vi-VN"/>
+        </w:rPr>
+      </w:pPr>
+      <w:r>
+        <w:rPr>
+          <w:rFonts w:ascii="Times New Roman" w:hAnsi="Times New Roman" w:cs="Times New Roman"/>
+          <w:sz w:val="28"/>
+          <w:szCs w:val="28"/>
+          <w:lang w:val="vi-VN"/>
+        </w:rPr>
+        <w:drawing>
+          <wp:inline distT="0" distB="0" distL="0" distR="0" wp14:anchorId="5062A7B0" wp14:editId="70E4FEB7">
+            <wp:extent cx="5760720" cy="2325370"/>
+            <wp:effectExtent l="0" t="0" r="0" b="0"/>
+            <wp:docPr id="562271563" name="Picture 1"/>
+            <wp:cNvGraphicFramePr>
+              <a:graphicFrameLocks xmlns:a="http://schemas.openxmlformats.org/drawingml/2006/main" noChangeAspect="1"/>
+            </wp:cNvGraphicFramePr>
+            <a:graphic xmlns:a="http://schemas.openxmlformats.org/drawingml/2006/main">
+              <a:graphicData uri="http://schemas.openxmlformats.org/drawingml/2006/picture">
+                <pic:pic xmlns:pic="http://schemas.openxmlformats.org/drawingml/2006/picture">
+                  <pic:nvPicPr>
+                    <pic:cNvPr id="562271563" name=""/>
+                    <pic:cNvPicPr/>
+                  </pic:nvPicPr>
+                  <pic:blipFill>
+                    <a:blip r:embed="rId32"/>
+                    <a:stretch>
+                      <a:fillRect/>
+                    </a:stretch>
+                  </pic:blipFill>
+                  <pic:spPr>
+                    <a:xfrm>
+                      <a:off x="0" y="0"/>
+                      <a:ext cx="5760720" cy="2325370"/>
+                    </a:xfrm>
+                    <a:prstGeom prst="rect">
+                      <a:avLst/>
+                    </a:prstGeom>
+                  </pic:spPr>
+                </pic:pic>
+              </a:graphicData>
+            </a:graphic>
+          </wp:inline>
+        </w:drawing>
+      </w:r>
+    </w:p>
+    <w:p>
+      <w:pPr>
+        <w:rPr>
+          <w:rFonts w:ascii="Times New Roman" w:hAnsi="Times New Roman" w:cs="Times New Roman"/>
+          <w:sz w:val="28"/>
+          <w:szCs w:val="28"/>
+          <w:lang w:val="vi-VN"/>
+        </w:rPr>
+      </w:pPr>
+      <w:r>
+        <w:rPr>
+          <w:rFonts w:ascii="Times New Roman" w:hAnsi="Times New Roman" w:cs="Times New Roman"/>
+          <w:sz w:val="28"/>
+          <w:szCs w:val="28"/>
+        </w:rPr>
+        <w:t xml:space="preserve">Câu 91. Thêm một sinh viên và kiểm tra dữ liệu trên MongoDB Atlas. (Gợi ý: Sử dụng Form </w:t>
+      </w:r>
+      <w:r>
+        <w:rPr>
+          <w:rFonts w:ascii="Times New Roman" w:hAnsi="Times New Roman" w:cs="Times New Roman"/>
+          <w:sz w:val="28"/>
+          <w:szCs w:val="28"/>
+        </w:rPr>
+        <w:t>t</w:t>
+      </w:r>
+      <w:r>
+        <w:rPr>
+          <w:rFonts w:ascii="Times New Roman" w:hAnsi="Times New Roman" w:cs="Times New Roman"/>
+          <w:sz w:val="28"/>
+          <w:szCs w:val="28"/>
+        </w:rPr>
+        <w:t xml:space="preserve">rên React.) </w:t>
+      </w:r>
+    </w:p>
+    <w:p>
+      <w:pPr>
+        <w:rPr>
+          <w:rFonts w:ascii="Times New Roman" w:hAnsi="Times New Roman" w:cs="Times New Roman"/>
+          <w:sz w:val="28"/>
+          <w:szCs w:val="28"/>
+          <w:lang w:val="vi-VN"/>
+        </w:rPr>
+      </w:pPr>
+      <w:r>
+        <w:rPr>
+          <w:rFonts w:ascii="Times New Roman" w:hAnsi="Times New Roman" w:cs="Times New Roman"/>
+          <w:sz w:val="28"/>
+          <w:szCs w:val="28"/>
+          <w:lang w:val="vi-VN"/>
+        </w:rPr>
+        <w:lastRenderedPageBreak/>
+        <w:drawing>
+          <wp:inline distT="0" distB="0" distL="0" distR="0" wp14:anchorId="6C7ECEC4" wp14:editId="48BDF1DA">
+            <wp:extent cx="5760720" cy="1692910"/>
+            <wp:effectExtent l="0" t="0" r="0" b="2540"/>
+            <wp:docPr id="1755416623" name="Picture 1"/>
+            <wp:cNvGraphicFramePr>
+              <a:graphicFrameLocks xmlns:a="http://schemas.openxmlformats.org/drawingml/2006/main" noChangeAspect="1"/>
+            </wp:cNvGraphicFramePr>
+            <a:graphic xmlns:a="http://schemas.openxmlformats.org/drawingml/2006/main">
+              <a:graphicData uri="http://schemas.openxmlformats.org/drawingml/2006/picture">
+                <pic:pic xmlns:pic="http://schemas.openxmlformats.org/drawingml/2006/picture">
+                  <pic:nvPicPr>
+                    <pic:cNvPr id="1755416623" name=""/>
+                    <pic:cNvPicPr/>
+                  </pic:nvPicPr>
+                  <pic:blipFill>
+                    <a:blip r:embed="rId33"/>
+                    <a:stretch>
+                      <a:fillRect/>
+                    </a:stretch>
+                  </pic:blipFill>
+                  <pic:spPr>
+                    <a:xfrm>
+                      <a:off x="0" y="0"/>
+                      <a:ext cx="5760720" cy="1692910"/>
+                    </a:xfrm>
+                    <a:prstGeom prst="rect">
+                      <a:avLst/>
+                    </a:prstGeom>
+                  </pic:spPr>
+                </pic:pic>
+              </a:graphicData>
+            </a:graphic>
+          </wp:inline>
+        </w:drawing>
+      </w:r>
+    </w:p>
+    <w:p>
+      <w:pPr>
+        <w:rPr>
+          <w:rFonts w:ascii="Times New Roman" w:hAnsi="Times New Roman" w:cs="Times New Roman"/>
+          <w:sz w:val="28"/>
+          <w:szCs w:val="28"/>
+          <w:lang w:val="vi-VN"/>
+        </w:rPr>
+      </w:pPr>
+      <w:r>
+        <w:rPr>
+          <w:rFonts w:ascii="Times New Roman" w:hAnsi="Times New Roman" w:cs="Times New Roman"/>
+          <w:sz w:val="28"/>
+          <w:szCs w:val="28"/>
+        </w:rPr>
+        <w:t xml:space="preserve">Câu 92. Dừng toàn bộ hệ thống MERN bằng Docker Compose. (Gợi ý lệnh: docker compose down) </w:t>
+      </w:r>
+    </w:p>
+    <w:p>
+      <w:pPr>
+        <w:rPr>
+          <w:rFonts w:ascii="Times New Roman" w:hAnsi="Times New Roman" w:cs="Times New Roman"/>
+          <w:sz w:val="28"/>
+          <w:szCs w:val="28"/>
+          <w:lang w:val="vi-VN"/>
+        </w:rPr>
+      </w:pPr>
+      <w:r>
+        <w:rPr>
+          <w:rFonts w:ascii="Times New Roman" w:hAnsi="Times New Roman" w:cs="Times New Roman"/>
+          <w:sz w:val="28"/>
+          <w:szCs w:val="28"/>
+          <w:lang w:val="vi-VN"/>
+        </w:rPr>
+        <w:drawing>
+          <wp:inline distT="0" distB="0" distL="0" distR="0" wp14:anchorId="6DFCA4F4" wp14:editId="105122D3">
+            <wp:extent cx="4239217" cy="1524213"/>
+            <wp:effectExtent l="0" t="0" r="9525" b="0"/>
+            <wp:docPr id="1347233893" name="Picture 1"/>
+            <wp:cNvGraphicFramePr>
+              <a:graphicFrameLocks xmlns:a="http://schemas.openxmlformats.org/drawingml/2006/main" noChangeAspect="1"/>
+            </wp:cNvGraphicFramePr>
+            <a:graphic xmlns:a="http://schemas.openxmlformats.org/drawingml/2006/main">
+              <a:graphicData uri="http://schemas.openxmlformats.org/drawingml/2006/picture">
+                <pic:pic xmlns:pic="http://schemas.openxmlformats.org/drawingml/2006/picture">
+                  <pic:nvPicPr>
+                    <pic:cNvPr id="1347233893" name=""/>
+                    <pic:cNvPicPr/>
+                  </pic:nvPicPr>
+                  <pic:blipFill>
+                    <a:blip r:embed="rId34"/>
+                    <a:stretch>
+                      <a:fillRect/>
+                    </a:stretch>
+                  </pic:blipFill>
+                  <pic:spPr>
+                    <a:xfrm>
+                      <a:off x="0" y="0"/>
+                      <a:ext cx="4239217" cy="1524213"/>
+                    </a:xfrm>
+                    <a:prstGeom prst="rect">
+                      <a:avLst/>
+                    </a:prstGeom>
+                  </pic:spPr>
+                </pic:pic>
+              </a:graphicData>
+            </a:graphic>
+          </wp:inline>
+        </w:drawing>
+      </w:r>
+    </w:p>
+    <w:p>
+      <w:pPr>
+        <w:rPr>
+          <w:rFonts w:ascii="Times New Roman" w:hAnsi="Times New Roman" w:cs="Times New Roman"/>
+          <w:sz w:val="28"/>
+          <w:szCs w:val="28"/>
+        </w:rPr>
+      </w:pPr>
+      <w:r>
+        <w:rPr>
+          <w:rFonts w:ascii="Times New Roman" w:hAnsi="Times New Roman" w:cs="Times New Roman"/>
+          <w:sz w:val="28"/>
+          <w:szCs w:val="28"/>
+        </w:rPr>
+        <w:t xml:space="preserve">Câu 93. Khởi động lại toàn bộ hệ thống bằng Docker Compose. (Gợi ý lệnh: docker compose up -d) </w:t>
+      </w:r>
+    </w:p>
+    <w:p>
+      <w:pPr>
+        <w:rPr>
+          <w:rFonts w:ascii="Times New Roman" w:hAnsi="Times New Roman" w:cs="Times New Roman"/>
+          <w:sz w:val="28"/>
+          <w:szCs w:val="28"/>
+          <w:lang w:val="vi-VN"/>
+        </w:rPr>
+      </w:pPr>
+      <w:r>
+        <w:rPr>
+          <w:rFonts w:ascii="Times New Roman" w:hAnsi="Times New Roman" w:cs="Times New Roman"/>
+          <w:sz w:val="28"/>
+          <w:szCs w:val="28"/>
+          <w:lang w:val="vi-VN"/>
+        </w:rPr>
+        <w:drawing>
+          <wp:inline distT="0" distB="0" distL="0" distR="0" wp14:anchorId="6C3A21A7" wp14:editId="0D29EBBF">
+            <wp:extent cx="4477375" cy="1305107"/>
+            <wp:effectExtent l="0" t="0" r="0" b="9525"/>
+            <wp:docPr id="620337935" name="Picture 1"/>
+            <wp:cNvGraphicFramePr>
+              <a:graphicFrameLocks xmlns:a="http://schemas.openxmlformats.org/drawingml/2006/main" noChangeAspect="1"/>
+            </wp:cNvGraphicFramePr>
+            <a:graphic xmlns:a="http://schemas.openxmlformats.org/drawingml/2006/main">
+              <a:graphicData uri="http://schemas.openxmlformats.org/drawingml/2006/picture">
+                <pic:pic xmlns:pic="http://schemas.openxmlformats.org/drawingml/2006/picture">
+                  <pic:nvPicPr>
+                    <pic:cNvPr id="620337935" name=""/>
+                    <pic:cNvPicPr/>
+                  </pic:nvPicPr>
+                  <pic:blipFill>
+                    <a:blip r:embed="rId35"/>
+                    <a:stretch>
+                      <a:fillRect/>
+                    </a:stretch>
+                  </pic:blipFill>
+                  <pic:spPr>
+                    <a:xfrm>
+                      <a:off x="0" y="0"/>
+                      <a:ext cx="4477375" cy="1305107"/>
+                    </a:xfrm>
+                    <a:prstGeom prst="rect">
+                      <a:avLst/>
+                    </a:prstGeom>
+                  </pic:spPr>
+                </pic:pic>
+              </a:graphicData>
+            </a:graphic>
+          </wp:inline>
+        </w:drawing>
+      </w:r>
+    </w:p>
+    <w:p>
+      <w:pPr>
+        <w:rPr>
+          <w:rFonts w:ascii="Times New Roman" w:hAnsi="Times New Roman" w:cs="Times New Roman"/>
+          <w:sz w:val="28"/>
+          <w:szCs w:val="28"/>
+          <w:lang w:val="vi-VN"/>
+        </w:rPr>
+      </w:pPr>
+      <w:r>
+        <w:rPr>
+          <w:rFonts w:ascii="Times New Roman" w:hAnsi="Times New Roman" w:cs="Times New Roman"/>
+          <w:sz w:val="28"/>
+          <w:szCs w:val="28"/>
+        </w:rPr>
+        <w:t xml:space="preserve">Câu 94. Kiểm tra lại ứng dụng sau khi khởi động lại các Container. (Gợi ý: Sử dụng docker compose ps và truy cập Frontend bằng trình duyệt.) </w:t>
+      </w:r>
+    </w:p>
+    <w:p>
+      <w:pPr>
+        <w:rPr>
+          <w:rFonts w:ascii="Times New Roman" w:hAnsi="Times New Roman" w:cs="Times New Roman"/>
+          <w:sz w:val="28"/>
+          <w:szCs w:val="28"/>
+          <w:lang w:val="vi-VN"/>
+        </w:rPr>
+      </w:pPr>
+      <w:r>
+        <w:rPr>
+          <w:rFonts w:ascii="Times New Roman" w:hAnsi="Times New Roman" w:cs="Times New Roman"/>
+          <w:sz w:val="28"/>
+          <w:szCs w:val="28"/>
+          <w:lang w:val="vi-VN"/>
+        </w:rPr>
+        <w:drawing>
+          <wp:inline distT="0" distB="0" distL="0" distR="0" wp14:anchorId="2944DE4B" wp14:editId="578A1DF8">
+            <wp:extent cx="5760720" cy="494030"/>
+            <wp:effectExtent l="0" t="0" r="0" b="1270"/>
+            <wp:docPr id="808870682" name="Picture 1"/>
+            <wp:cNvGraphicFramePr>
+              <a:graphicFrameLocks xmlns:a="http://schemas.openxmlformats.org/drawingml/2006/main" noChangeAspect="1"/>
+            </wp:cNvGraphicFramePr>
+            <a:graphic xmlns:a="http://schemas.openxmlformats.org/drawingml/2006/main">
+              <a:graphicData uri="http://schemas.openxmlformats.org/drawingml/2006/picture">
+                <pic:pic xmlns:pic="http://schemas.openxmlformats.org/drawingml/2006/picture">
+                  <pic:nvPicPr>
+                    <pic:cNvPr id="808870682" name=""/>
+                    <pic:cNvPicPr/>
+                  </pic:nvPicPr>
+                  <pic:blipFill>
+                    <a:blip r:embed="rId36"/>
+                    <a:stretch>
+                      <a:fillRect/>
+                    </a:stretch>
+                  </pic:blipFill>
+                  <pic:spPr>
+                    <a:xfrm>
+                      <a:off x="0" y="0"/>
+                      <a:ext cx="5760720" cy="494030"/>
+                    </a:xfrm>
+                    <a:prstGeom prst="rect">
+                      <a:avLst/>
+                    </a:prstGeom>
+                  </pic:spPr>
+                </pic:pic>
+              </a:graphicData>
+            </a:graphic>
+          </wp:inline>
+        </w:drawing>
+      </w:r>
+    </w:p>
+    <w:p>
+      <w:pPr>
+        <w:rPr>
+          <w:rFonts w:ascii="Times New Roman" w:hAnsi="Times New Roman" w:cs="Times New Roman"/>
+          <w:sz w:val="28"/>
+          <w:szCs w:val="28"/>
+          <w:lang w:val="vi-VN"/>
+        </w:rPr>
+      </w:pPr>
+      <w:r>
+        <w:rPr>
+          <w:rFonts w:ascii="Times New Roman" w:hAnsi="Times New Roman" w:cs="Times New Roman"/>
+          <w:sz w:val="28"/>
+          <w:szCs w:val="28"/>
+          <w:lang w:val="vi-VN"/>
+        </w:rPr>
+        <w:lastRenderedPageBreak/>
+        <w:drawing>
+          <wp:inline distT="0" distB="0" distL="0" distR="0" wp14:anchorId="6018B2E5" wp14:editId="2E835E51">
+            <wp:extent cx="5760720" cy="2667000"/>
+            <wp:effectExtent l="0" t="0" r="0" b="0"/>
+            <wp:docPr id="2001763138" name="Picture 1"/>
+            <wp:cNvGraphicFramePr>
+              <a:graphicFrameLocks xmlns:a="http://schemas.openxmlformats.org/drawingml/2006/main" noChangeAspect="1"/>
+            </wp:cNvGraphicFramePr>
+            <a:graphic xmlns:a="http://schemas.openxmlformats.org/drawingml/2006/main">
+              <a:graphicData uri="http://schemas.openxmlformats.org/drawingml/2006/picture">
+                <pic:pic xmlns:pic="http://schemas.openxmlformats.org/drawingml/2006/picture">
+                  <pic:nvPicPr>
+                    <pic:cNvPr id="2001763138" name=""/>
+                    <pic:cNvPicPr/>
+                  </pic:nvPicPr>
+                  <pic:blipFill>
+                    <a:blip r:embed="rId37"/>
+                    <a:stretch>
+                      <a:fillRect/>
+                    </a:stretch>
+                  </pic:blipFill>
+                  <pic:spPr>
+                    <a:xfrm>
+                      <a:off x="0" y="0"/>
+                      <a:ext cx="5760720" cy="2667000"/>
+                    </a:xfrm>
+                    <a:prstGeom prst="rect">
+                      <a:avLst/>
+                    </a:prstGeom>
+                  </pic:spPr>
+                </pic:pic>
+              </a:graphicData>
+            </a:graphic>
+          </wp:inline>
+        </w:drawing>
+      </w:r>
+    </w:p>
+    <w:p>
+      <w:pPr>
+        <w:rPr>
+          <w:rFonts w:ascii="Times New Roman" w:hAnsi="Times New Roman" w:cs="Times New Roman"/>
+          <w:sz w:val="28"/>
+          <w:szCs w:val="28"/>
+        </w:rPr>
+      </w:pPr>
+      <w:r>
+        <w:rPr>
+          <w:rFonts w:ascii="Times New Roman" w:hAnsi="Times New Roman" w:cs="Times New Roman"/>
+          <w:sz w:val="28"/>
+          <w:szCs w:val="28"/>
+        </w:rPr>
+        <w:t xml:space="preserve">Mục tiêu: Sinh viên sử dụng Docker Compose để xây dựng và quản lý đồng thời Frontend </w:t>
+      </w:r>
+    </w:p>
+    <w:p>
+      <w:pPr>
+        <w:rPr>
+          <w:rFonts w:ascii="Times New Roman" w:hAnsi="Times New Roman" w:cs="Times New Roman"/>
+          <w:sz w:val="28"/>
+          <w:szCs w:val="28"/>
+        </w:rPr>
+      </w:pPr>
+      <w:r>
+        <w:rPr>
+          <w:rFonts w:ascii="Times New Roman" w:hAnsi="Times New Roman" w:cs="Times New Roman"/>
+          <w:sz w:val="28"/>
+          <w:szCs w:val="28"/>
+        </w:rPr>
+        <w:t xml:space="preserve">Container và Backend Container. </w:t>
       </w:r>
     </w:p>
     <w:p>
@@ -915,6 +2672,533 @@
           <w:sz w:val="28"/>
           <w:szCs w:val="28"/>
         </w:rPr>
+        <w:t>PHẦN 7. GIT VÀ HOÀN THÀNH BÀI</w:t>
+      </w:r>
+    </w:p>
+    <w:p>
+      <w:pPr>
+        <w:jc w:val="center"/>
+        <w:rPr>
+          <w:rFonts w:ascii="Times New Roman" w:hAnsi="Times New Roman" w:cs="Times New Roman"/>
+          <w:b/>
+          <w:bCs/>
+          <w:sz w:val="28"/>
+          <w:szCs w:val="28"/>
+        </w:rPr>
+      </w:pPr>
+      <w:r>
+        <w:rPr>
+          <w:rFonts w:ascii="Times New Roman" w:hAnsi="Times New Roman" w:cs="Times New Roman"/>
+          <w:b/>
+          <w:bCs/>
+          <w:sz w:val="28"/>
+          <w:szCs w:val="28"/>
+        </w:rPr>
+        <w:t>THỰC HÀNH</w:t>
+      </w:r>
+    </w:p>
+    <w:p>
+      <w:pPr>
+        <w:rPr>
+          <w:rFonts w:ascii="Times New Roman" w:hAnsi="Times New Roman" w:cs="Times New Roman"/>
+          <w:sz w:val="28"/>
+          <w:szCs w:val="28"/>
+          <w:lang w:val="vi-VN"/>
+        </w:rPr>
+      </w:pPr>
+      <w:r>
+        <w:rPr>
+          <w:rFonts w:ascii="Times New Roman" w:hAnsi="Times New Roman" w:cs="Times New Roman"/>
+          <w:sz w:val="28"/>
+          <w:szCs w:val="28"/>
+        </w:rPr>
+        <w:t xml:space="preserve">Câu 95. Kiểm tra các file đã thay đổi sau khi hoàn thành Buổi 3. (Gợi ý lệnh: git status) </w:t>
+      </w:r>
+    </w:p>
+    <w:p>
+      <w:pPr>
+        <w:rPr>
+          <w:rFonts w:ascii="Times New Roman" w:hAnsi="Times New Roman" w:cs="Times New Roman"/>
+          <w:sz w:val="28"/>
+          <w:szCs w:val="28"/>
+          <w:lang w:val="vi-VN"/>
+        </w:rPr>
+      </w:pPr>
+      <w:r>
+        <w:rPr>
+          <w:rFonts w:ascii="Times New Roman" w:hAnsi="Times New Roman" w:cs="Times New Roman"/>
+          <w:sz w:val="28"/>
+          <w:szCs w:val="28"/>
+          <w:lang w:val="vi-VN"/>
+        </w:rPr>
+        <w:drawing>
+          <wp:inline distT="0" distB="0" distL="0" distR="0" wp14:anchorId="03CD4C9C" wp14:editId="3C9DD152">
+            <wp:extent cx="5760720" cy="3643630"/>
+            <wp:effectExtent l="0" t="0" r="0" b="0"/>
+            <wp:docPr id="193158566" name="Picture 1"/>
+            <wp:cNvGraphicFramePr>
+              <a:graphicFrameLocks xmlns:a="http://schemas.openxmlformats.org/drawingml/2006/main" noChangeAspect="1"/>
+            </wp:cNvGraphicFramePr>
+            <a:graphic xmlns:a="http://schemas.openxmlformats.org/drawingml/2006/main">
+              <a:graphicData uri="http://schemas.openxmlformats.org/drawingml/2006/picture">
+                <pic:pic xmlns:pic="http://schemas.openxmlformats.org/drawingml/2006/picture">
+                  <pic:nvPicPr>
+                    <pic:cNvPr id="193158566" name=""/>
+                    <pic:cNvPicPr/>
+                  </pic:nvPicPr>
+                  <pic:blipFill>
+                    <a:blip r:embed="rId38"/>
+                    <a:stretch>
+                      <a:fillRect/>
+                    </a:stretch>
+                  </pic:blipFill>
+                  <pic:spPr>
+                    <a:xfrm>
+                      <a:off x="0" y="0"/>
+                      <a:ext cx="5760720" cy="3643630"/>
+                    </a:xfrm>
+                    <a:prstGeom prst="rect">
+                      <a:avLst/>
+                    </a:prstGeom>
+                  </pic:spPr>
+                </pic:pic>
+              </a:graphicData>
+            </a:graphic>
+          </wp:inline>
+        </w:drawing>
+      </w:r>
+    </w:p>
+    <w:p>
+      <w:pPr>
+        <w:rPr>
+          <w:rFonts w:ascii="Times New Roman" w:hAnsi="Times New Roman" w:cs="Times New Roman"/>
+          <w:sz w:val="28"/>
+          <w:szCs w:val="28"/>
+          <w:lang w:val="vi-VN"/>
+        </w:rPr>
+      </w:pPr>
+      <w:r>
+        <w:rPr>
+          <w:rFonts w:ascii="Times New Roman" w:hAnsi="Times New Roman" w:cs="Times New Roman"/>
+          <w:sz w:val="28"/>
+          <w:szCs w:val="28"/>
+        </w:rPr>
+        <w:lastRenderedPageBreak/>
+        <w:t xml:space="preserve">Câu 96. Kiểm tra .gitignore và đảm bảo file .env không được đưa vào Git. (Gợi ý lệnh: git status) </w:t>
+      </w:r>
+    </w:p>
+    <w:p>
+      <w:pPr>
+        <w:rPr>
+          <w:rFonts w:ascii="Times New Roman" w:hAnsi="Times New Roman" w:cs="Times New Roman"/>
+          <w:sz w:val="28"/>
+          <w:szCs w:val="28"/>
+          <w:lang w:val="vi-VN"/>
+        </w:rPr>
+      </w:pPr>
+      <w:r>
+        <w:rPr>
+          <w:rFonts w:ascii="Times New Roman" w:hAnsi="Times New Roman" w:cs="Times New Roman"/>
+          <w:sz w:val="28"/>
+          <w:szCs w:val="28"/>
+          <w:lang w:val="vi-VN"/>
+        </w:rPr>
+        <w:drawing>
+          <wp:inline distT="0" distB="0" distL="0" distR="0" wp14:anchorId="64556FF1" wp14:editId="617427B0">
+            <wp:extent cx="5760720" cy="3643630"/>
+            <wp:effectExtent l="0" t="0" r="0" b="0"/>
+            <wp:docPr id="334892017" name="Picture 1"/>
+            <wp:cNvGraphicFramePr>
+              <a:graphicFrameLocks xmlns:a="http://schemas.openxmlformats.org/drawingml/2006/main" noChangeAspect="1"/>
+            </wp:cNvGraphicFramePr>
+            <a:graphic xmlns:a="http://schemas.openxmlformats.org/drawingml/2006/main">
+              <a:graphicData uri="http://schemas.openxmlformats.org/drawingml/2006/picture">
+                <pic:pic xmlns:pic="http://schemas.openxmlformats.org/drawingml/2006/picture">
+                  <pic:nvPicPr>
+                    <pic:cNvPr id="334892017" name=""/>
+                    <pic:cNvPicPr/>
+                  </pic:nvPicPr>
+                  <pic:blipFill>
+                    <a:blip r:embed="rId38"/>
+                    <a:stretch>
+                      <a:fillRect/>
+                    </a:stretch>
+                  </pic:blipFill>
+                  <pic:spPr>
+                    <a:xfrm>
+                      <a:off x="0" y="0"/>
+                      <a:ext cx="5760720" cy="3643630"/>
+                    </a:xfrm>
+                    <a:prstGeom prst="rect">
+                      <a:avLst/>
+                    </a:prstGeom>
+                  </pic:spPr>
+                </pic:pic>
+              </a:graphicData>
+            </a:graphic>
+          </wp:inline>
+        </w:drawing>
+      </w:r>
+    </w:p>
+    <w:p>
+      <w:pPr>
+        <w:rPr>
+          <w:rFonts w:ascii="Times New Roman" w:hAnsi="Times New Roman" w:cs="Times New Roman"/>
+          <w:sz w:val="28"/>
+          <w:szCs w:val="28"/>
+          <w:lang w:val="vi-VN"/>
+        </w:rPr>
+      </w:pPr>
+      <w:r>
+        <w:rPr>
+          <w:rFonts w:ascii="Times New Roman" w:hAnsi="Times New Roman" w:cs="Times New Roman"/>
+          <w:sz w:val="28"/>
+          <w:szCs w:val="28"/>
+        </w:rPr>
+        <w:t xml:space="preserve">Câu 97. Kiểm tra các file Docker trước khi commit. (Gợi ý: Kiểm tra client/Dockerfile, server/Dockerfile và docker-compose.yml.) </w:t>
+      </w:r>
+    </w:p>
+    <w:p>
+      <w:pPr>
+        <w:jc w:val="center"/>
+        <w:rPr>
+          <w:rFonts w:ascii="Times New Roman" w:hAnsi="Times New Roman" w:cs="Times New Roman"/>
+          <w:sz w:val="28"/>
+          <w:szCs w:val="28"/>
+          <w:lang w:val="vi-VN"/>
+        </w:rPr>
+      </w:pPr>
+      <w:r>
+        <w:rPr>
+          <w:rFonts w:ascii="Times New Roman" w:hAnsi="Times New Roman" w:cs="Times New Roman"/>
+          <w:sz w:val="28"/>
+          <w:szCs w:val="28"/>
+          <w:lang w:val="vi-VN"/>
+        </w:rPr>
+        <w:lastRenderedPageBreak/>
+        <w:drawing>
+          <wp:inline distT="0" distB="0" distL="0" distR="0" wp14:anchorId="662E9BDE" wp14:editId="251E7BF3">
+            <wp:extent cx="4544059" cy="4267796"/>
+            <wp:effectExtent l="0" t="0" r="0" b="0"/>
+            <wp:docPr id="377147975" name="Picture 1"/>
+            <wp:cNvGraphicFramePr>
+              <a:graphicFrameLocks xmlns:a="http://schemas.openxmlformats.org/drawingml/2006/main" noChangeAspect="1"/>
+            </wp:cNvGraphicFramePr>
+            <a:graphic xmlns:a="http://schemas.openxmlformats.org/drawingml/2006/main">
+              <a:graphicData uri="http://schemas.openxmlformats.org/drawingml/2006/picture">
+                <pic:pic xmlns:pic="http://schemas.openxmlformats.org/drawingml/2006/picture">
+                  <pic:nvPicPr>
+                    <pic:cNvPr id="377147975" name=""/>
+                    <pic:cNvPicPr/>
+                  </pic:nvPicPr>
+                  <pic:blipFill>
+                    <a:blip r:embed="rId39"/>
+                    <a:stretch>
+                      <a:fillRect/>
+                    </a:stretch>
+                  </pic:blipFill>
+                  <pic:spPr>
+                    <a:xfrm>
+                      <a:off x="0" y="0"/>
+                      <a:ext cx="4544059" cy="4267796"/>
+                    </a:xfrm>
+                    <a:prstGeom prst="rect">
+                      <a:avLst/>
+                    </a:prstGeom>
+                  </pic:spPr>
+                </pic:pic>
+              </a:graphicData>
+            </a:graphic>
+          </wp:inline>
+        </w:drawing>
+      </w:r>
+    </w:p>
+    <w:p>
+      <w:pPr>
+        <w:rPr>
+          <w:rFonts w:ascii="Times New Roman" w:hAnsi="Times New Roman" w:cs="Times New Roman"/>
+          <w:sz w:val="28"/>
+          <w:szCs w:val="28"/>
+          <w:lang w:val="vi-VN"/>
+        </w:rPr>
+      </w:pPr>
+      <w:r>
+        <w:rPr>
+          <w:rFonts w:ascii="Times New Roman" w:hAnsi="Times New Roman" w:cs="Times New Roman"/>
+          <w:sz w:val="28"/>
+          <w:szCs w:val="28"/>
+        </w:rPr>
+        <w:t xml:space="preserve">Câu 98. Đưa source code và cấu hình Docker vào Staging Area. (Gợi ý lệnh: git add .) </w:t>
+      </w:r>
+    </w:p>
+    <w:p>
+      <w:pPr>
+        <w:rPr>
+          <w:rFonts w:ascii="Times New Roman" w:hAnsi="Times New Roman" w:cs="Times New Roman"/>
+          <w:sz w:val="28"/>
+          <w:szCs w:val="28"/>
+          <w:lang w:val="vi-VN"/>
+        </w:rPr>
+      </w:pPr>
+      <w:r>
+        <w:rPr>
+          <w:rFonts w:ascii="Times New Roman" w:hAnsi="Times New Roman" w:cs="Times New Roman"/>
+          <w:sz w:val="28"/>
+          <w:szCs w:val="28"/>
+          <w:lang w:val="vi-VN"/>
+        </w:rPr>
+        <w:drawing>
+          <wp:inline distT="0" distB="0" distL="0" distR="0" wp14:anchorId="4F4EE74E" wp14:editId="207A6D73">
+            <wp:extent cx="5760720" cy="434975"/>
+            <wp:effectExtent l="0" t="0" r="0" b="3175"/>
+            <wp:docPr id="1020223689" name="Picture 1"/>
+            <wp:cNvGraphicFramePr>
+              <a:graphicFrameLocks xmlns:a="http://schemas.openxmlformats.org/drawingml/2006/main" noChangeAspect="1"/>
+            </wp:cNvGraphicFramePr>
+            <a:graphic xmlns:a="http://schemas.openxmlformats.org/drawingml/2006/main">
+              <a:graphicData uri="http://schemas.openxmlformats.org/drawingml/2006/picture">
+                <pic:pic xmlns:pic="http://schemas.openxmlformats.org/drawingml/2006/picture">
+                  <pic:nvPicPr>
+                    <pic:cNvPr id="1020223689" name=""/>
+                    <pic:cNvPicPr/>
+                  </pic:nvPicPr>
+                  <pic:blipFill>
+                    <a:blip r:embed="rId40"/>
+                    <a:stretch>
+                      <a:fillRect/>
+                    </a:stretch>
+                  </pic:blipFill>
+                  <pic:spPr>
+                    <a:xfrm>
+                      <a:off x="0" y="0"/>
+                      <a:ext cx="5760720" cy="434975"/>
+                    </a:xfrm>
+                    <a:prstGeom prst="rect">
+                      <a:avLst/>
+                    </a:prstGeom>
+                  </pic:spPr>
+                </pic:pic>
+              </a:graphicData>
+            </a:graphic>
+          </wp:inline>
+        </w:drawing>
+      </w:r>
+    </w:p>
+    <w:p>
+      <w:pPr>
+        <w:rPr>
+          <w:rFonts w:ascii="Times New Roman" w:hAnsi="Times New Roman" w:cs="Times New Roman"/>
+          <w:sz w:val="28"/>
+          <w:szCs w:val="28"/>
+          <w:lang w:val="vi-VN"/>
+        </w:rPr>
+      </w:pPr>
+      <w:r>
+        <w:rPr>
+          <w:rFonts w:ascii="Times New Roman" w:hAnsi="Times New Roman" w:cs="Times New Roman"/>
+          <w:sz w:val="28"/>
+          <w:szCs w:val="28"/>
+          <w:lang w:val="vi-VN"/>
+        </w:rPr>
+        <w:drawing>
+          <wp:inline distT="0" distB="0" distL="0" distR="0" wp14:anchorId="462B6971" wp14:editId="0A78DB50">
+            <wp:extent cx="4744112" cy="3057952"/>
+            <wp:effectExtent l="0" t="0" r="0" b="9525"/>
+            <wp:docPr id="1986630626" name="Picture 1"/>
+            <wp:cNvGraphicFramePr>
+              <a:graphicFrameLocks xmlns:a="http://schemas.openxmlformats.org/drawingml/2006/main" noChangeAspect="1"/>
+            </wp:cNvGraphicFramePr>
+            <a:graphic xmlns:a="http://schemas.openxmlformats.org/drawingml/2006/main">
+              <a:graphicData uri="http://schemas.openxmlformats.org/drawingml/2006/picture">
+                <pic:pic xmlns:pic="http://schemas.openxmlformats.org/drawingml/2006/picture">
+                  <pic:nvPicPr>
+                    <pic:cNvPr id="1986630626" name=""/>
+                    <pic:cNvPicPr/>
+                  </pic:nvPicPr>
+                  <pic:blipFill>
+                    <a:blip r:embed="rId41"/>
+                    <a:stretch>
+                      <a:fillRect/>
+                    </a:stretch>
+                  </pic:blipFill>
+                  <pic:spPr>
+                    <a:xfrm>
+                      <a:off x="0" y="0"/>
+                      <a:ext cx="4744112" cy="3057952"/>
+                    </a:xfrm>
+                    <a:prstGeom prst="rect">
+                      <a:avLst/>
+                    </a:prstGeom>
+                  </pic:spPr>
+                </pic:pic>
+              </a:graphicData>
+            </a:graphic>
+          </wp:inline>
+        </w:drawing>
+      </w:r>
+    </w:p>
+    <w:p>
+      <w:pPr>
+        <w:rPr>
+          <w:rFonts w:ascii="Times New Roman" w:hAnsi="Times New Roman" w:cs="Times New Roman"/>
+          <w:sz w:val="28"/>
+          <w:szCs w:val="28"/>
+          <w:lang w:val="vi-VN"/>
+        </w:rPr>
+      </w:pPr>
+      <w:r>
+        <w:rPr>
+          <w:rFonts w:ascii="Times New Roman" w:hAnsi="Times New Roman" w:cs="Times New Roman"/>
+          <w:sz w:val="28"/>
+          <w:szCs w:val="28"/>
+        </w:rPr>
+        <w:lastRenderedPageBreak/>
+        <w:t xml:space="preserve">Câu 99. Tạo commit cho kết quả thực hành Buổi 3. (Gợi ý lệnh: git commit -m "Complete Lab 03 Docker MERN") </w:t>
+      </w:r>
+    </w:p>
+    <w:p>
+      <w:pPr>
+        <w:rPr>
+          <w:rFonts w:ascii="Times New Roman" w:hAnsi="Times New Roman" w:cs="Times New Roman"/>
+          <w:sz w:val="28"/>
+          <w:szCs w:val="28"/>
+          <w:lang w:val="vi-VN"/>
+        </w:rPr>
+      </w:pPr>
+      <w:r>
+        <w:rPr>
+          <w:rFonts w:ascii="Times New Roman" w:hAnsi="Times New Roman" w:cs="Times New Roman"/>
+          <w:sz w:val="28"/>
+          <w:szCs w:val="28"/>
+          <w:lang w:val="vi-VN"/>
+        </w:rPr>
+        <w:drawing>
+          <wp:inline distT="0" distB="0" distL="0" distR="0" wp14:anchorId="44D44519" wp14:editId="1E6BA175">
+            <wp:extent cx="5696745" cy="1676634"/>
+            <wp:effectExtent l="0" t="0" r="0" b="0"/>
+            <wp:docPr id="210189648" name="Picture 1"/>
+            <wp:cNvGraphicFramePr>
+              <a:graphicFrameLocks xmlns:a="http://schemas.openxmlformats.org/drawingml/2006/main" noChangeAspect="1"/>
+            </wp:cNvGraphicFramePr>
+            <a:graphic xmlns:a="http://schemas.openxmlformats.org/drawingml/2006/main">
+              <a:graphicData uri="http://schemas.openxmlformats.org/drawingml/2006/picture">
+                <pic:pic xmlns:pic="http://schemas.openxmlformats.org/drawingml/2006/picture">
+                  <pic:nvPicPr>
+                    <pic:cNvPr id="210189648" name=""/>
+                    <pic:cNvPicPr/>
+                  </pic:nvPicPr>
+                  <pic:blipFill>
+                    <a:blip r:embed="rId42"/>
+                    <a:stretch>
+                      <a:fillRect/>
+                    </a:stretch>
+                  </pic:blipFill>
+                  <pic:spPr>
+                    <a:xfrm>
+                      <a:off x="0" y="0"/>
+                      <a:ext cx="5696745" cy="1676634"/>
+                    </a:xfrm>
+                    <a:prstGeom prst="rect">
+                      <a:avLst/>
+                    </a:prstGeom>
+                  </pic:spPr>
+                </pic:pic>
+              </a:graphicData>
+            </a:graphic>
+          </wp:inline>
+        </w:drawing>
+      </w:r>
+    </w:p>
+    <w:p>
+      <w:pPr>
+        <w:rPr>
+          <w:rFonts w:ascii="Times New Roman" w:hAnsi="Times New Roman" w:cs="Times New Roman"/>
+          <w:sz w:val="28"/>
+          <w:szCs w:val="28"/>
+          <w:lang w:val="vi-VN"/>
+        </w:rPr>
+      </w:pPr>
+      <w:r>
+        <w:rPr>
+          <w:rFonts w:ascii="Times New Roman" w:hAnsi="Times New Roman" w:cs="Times New Roman"/>
+          <w:sz w:val="28"/>
+          <w:szCs w:val="28"/>
+        </w:rPr>
+        <w:t xml:space="preserve">Câu 100. Push source code lên GitHub. (Gợi ý lệnh: git push) </w:t>
+      </w:r>
+    </w:p>
+    <w:p>
+      <w:pPr>
+        <w:rPr>
+          <w:rFonts w:ascii="Times New Roman" w:hAnsi="Times New Roman" w:cs="Times New Roman"/>
+          <w:sz w:val="28"/>
+          <w:szCs w:val="28"/>
+          <w:lang w:val="vi-VN"/>
+        </w:rPr>
+      </w:pPr>
+      <w:r>
+        <w:rPr>
+          <w:rFonts w:ascii="Times New Roman" w:hAnsi="Times New Roman" w:cs="Times New Roman"/>
+          <w:sz w:val="28"/>
+          <w:szCs w:val="28"/>
+          <w:lang w:val="vi-VN"/>
+        </w:rPr>
+        <w:drawing>
+          <wp:inline distT="0" distB="0" distL="0" distR="0" wp14:anchorId="100F2116" wp14:editId="1A7EE587">
+            <wp:extent cx="5760720" cy="3067685"/>
+            <wp:effectExtent l="0" t="0" r="0" b="0"/>
+            <wp:docPr id="928147083" name="Picture 1"/>
+            <wp:cNvGraphicFramePr>
+              <a:graphicFrameLocks xmlns:a="http://schemas.openxmlformats.org/drawingml/2006/main" noChangeAspect="1"/>
+            </wp:cNvGraphicFramePr>
+            <a:graphic xmlns:a="http://schemas.openxmlformats.org/drawingml/2006/main">
+              <a:graphicData uri="http://schemas.openxmlformats.org/drawingml/2006/picture">
+                <pic:pic xmlns:pic="http://schemas.openxmlformats.org/drawingml/2006/picture">
+                  <pic:nvPicPr>
+                    <pic:cNvPr id="928147083" name=""/>
+                    <pic:cNvPicPr/>
+                  </pic:nvPicPr>
+                  <pic:blipFill>
+                    <a:blip r:embed="rId43"/>
+                    <a:stretch>
+                      <a:fillRect/>
+                    </a:stretch>
+                  </pic:blipFill>
+                  <pic:spPr>
+                    <a:xfrm>
+                      <a:off x="0" y="0"/>
+                      <a:ext cx="5760720" cy="3067685"/>
+                    </a:xfrm>
+                    <a:prstGeom prst="rect">
+                      <a:avLst/>
+                    </a:prstGeom>
+                  </pic:spPr>
+                </pic:pic>
+              </a:graphicData>
+            </a:graphic>
+          </wp:inline>
+        </w:drawing>
+      </w:r>
+    </w:p>
+    <w:p>
+      <w:pPr>
+        <w:jc w:val="center"/>
+        <w:rPr>
+          <w:rFonts w:ascii="Times New Roman" w:hAnsi="Times New Roman" w:cs="Times New Roman"/>
+          <w:b/>
+          <w:bCs/>
+          <w:sz w:val="28"/>
+          <w:szCs w:val="28"/>
+        </w:rPr>
+      </w:pPr>
+      <w:r>
+        <w:rPr>
+          <w:rFonts w:ascii="Times New Roman" w:hAnsi="Times New Roman" w:cs="Times New Roman"/>
+          <w:b/>
+          <w:bCs/>
+          <w:sz w:val="28"/>
+          <w:szCs w:val="28"/>
+        </w:rPr>
         <w:t>PHẦN 8. BÀI TẬP TỔNG HỢP</w:t>
       </w:r>
     </w:p>
@@ -941,6 +3225,60 @@
           <w:rFonts w:ascii="Times New Roman" w:hAnsi="Times New Roman" w:cs="Times New Roman"/>
           <w:sz w:val="28"/>
           <w:szCs w:val="28"/>
+          <w:lang w:val="vi-VN"/>
+        </w:rPr>
+      </w:pPr>
+      <w:r>
+        <w:rPr>
+          <w:rFonts w:ascii="Times New Roman" w:hAnsi="Times New Roman" w:cs="Times New Roman"/>
+          <w:sz w:val="28"/>
+          <w:szCs w:val="28"/>
+          <w:lang w:val="vi-VN"/>
+        </w:rPr>
+        <w:drawing>
+          <wp:inline distT="0" distB="0" distL="0" distR="0" wp14:anchorId="6D38AB79" wp14:editId="32171F71">
+            <wp:extent cx="4544059" cy="1314633"/>
+            <wp:effectExtent l="0" t="0" r="9525" b="0"/>
+            <wp:docPr id="2124647927" name="Picture 1"/>
+            <wp:cNvGraphicFramePr>
+              <a:graphicFrameLocks xmlns:a="http://schemas.openxmlformats.org/drawingml/2006/main" noChangeAspect="1"/>
+            </wp:cNvGraphicFramePr>
+            <a:graphic xmlns:a="http://schemas.openxmlformats.org/drawingml/2006/main">
+              <a:graphicData uri="http://schemas.openxmlformats.org/drawingml/2006/picture">
+                <pic:pic xmlns:pic="http://schemas.openxmlformats.org/drawingml/2006/picture">
+                  <pic:nvPicPr>
+                    <pic:cNvPr id="2124647927" name=""/>
+                    <pic:cNvPicPr/>
+                  </pic:nvPicPr>
+                  <pic:blipFill>
+                    <a:blip r:embed="rId44"/>
+                    <a:stretch>
+                      <a:fillRect/>
+                    </a:stretch>
+                  </pic:blipFill>
+                  <pic:spPr>
+                    <a:xfrm>
+                      <a:off x="0" y="0"/>
+                      <a:ext cx="4544059" cy="1314633"/>
+                    </a:xfrm>
+                    <a:prstGeom prst="rect">
+                      <a:avLst/>
+                    </a:prstGeom>
+                  </pic:spPr>
+                </pic:pic>
+              </a:graphicData>
+            </a:graphic>
+          </wp:inline>
+        </w:drawing>
+      </w:r>
+    </w:p>
+    <w:p>
+      <w:pPr>
+        <w:rPr>
+          <w:rFonts w:ascii="Times New Roman" w:hAnsi="Times New Roman" w:cs="Times New Roman"/>
+          <w:sz w:val="28"/>
+          <w:szCs w:val="28"/>
+          <w:lang w:val="vi-VN"/>
         </w:rPr>
       </w:pPr>
       <w:r>
@@ -958,74 +3296,247 @@
           <w:rFonts w:ascii="Times New Roman" w:hAnsi="Times New Roman" w:cs="Times New Roman"/>
           <w:sz w:val="28"/>
           <w:szCs w:val="28"/>
-        </w:rPr>
-      </w:pPr>
-      <w:r>
-        <w:rPr>
-          <w:rFonts w:ascii="Times New Roman" w:hAnsi="Times New Roman" w:cs="Times New Roman"/>
-          <w:sz w:val="28"/>
-          <w:szCs w:val="28"/>
+          <w:lang w:val="vi-VN"/>
+        </w:rPr>
+      </w:pPr>
+    </w:p>
+    <w:p>
+      <w:pPr>
+        <w:rPr>
+          <w:rFonts w:ascii="Times New Roman" w:hAnsi="Times New Roman" w:cs="Times New Roman"/>
+          <w:sz w:val="28"/>
+          <w:szCs w:val="28"/>
+          <w:lang w:val="vi-VN"/>
+        </w:rPr>
+      </w:pPr>
+      <w:r>
+        <w:rPr>
+          <w:rFonts w:ascii="Times New Roman" w:hAnsi="Times New Roman" w:cs="Times New Roman"/>
+          <w:sz w:val="28"/>
+          <w:szCs w:val="28"/>
+        </w:rPr>
+        <w:t xml:space="preserve">Câu 103. Kiểm tra trạng thái Backend Container và Frontend Container. (Gợi ý lệnh: docker compose ps) </w:t>
+      </w:r>
+    </w:p>
+    <w:p>
+      <w:pPr>
+        <w:rPr>
+          <w:rFonts w:ascii="Times New Roman" w:hAnsi="Times New Roman" w:cs="Times New Roman"/>
+          <w:sz w:val="28"/>
+          <w:szCs w:val="28"/>
+          <w:lang w:val="vi-VN"/>
+        </w:rPr>
+      </w:pPr>
+      <w:r>
+        <w:rPr>
+          <w:rFonts w:ascii="Times New Roman" w:hAnsi="Times New Roman" w:cs="Times New Roman"/>
+          <w:sz w:val="28"/>
+          <w:szCs w:val="28"/>
+          <w:lang w:val="vi-VN"/>
+        </w:rPr>
+        <w:drawing>
+          <wp:inline distT="0" distB="0" distL="0" distR="0" wp14:anchorId="61C62371" wp14:editId="094A80CB">
+            <wp:extent cx="5401429" cy="2819794"/>
+            <wp:effectExtent l="0" t="0" r="0" b="0"/>
+            <wp:docPr id="1107780640" name="Picture 1"/>
+            <wp:cNvGraphicFramePr>
+              <a:graphicFrameLocks xmlns:a="http://schemas.openxmlformats.org/drawingml/2006/main" noChangeAspect="1"/>
+            </wp:cNvGraphicFramePr>
+            <a:graphic xmlns:a="http://schemas.openxmlformats.org/drawingml/2006/main">
+              <a:graphicData uri="http://schemas.openxmlformats.org/drawingml/2006/picture">
+                <pic:pic xmlns:pic="http://schemas.openxmlformats.org/drawingml/2006/picture">
+                  <pic:nvPicPr>
+                    <pic:cNvPr id="1107780640" name=""/>
+                    <pic:cNvPicPr/>
+                  </pic:nvPicPr>
+                  <pic:blipFill>
+                    <a:blip r:embed="rId45"/>
+                    <a:stretch>
+                      <a:fillRect/>
+                    </a:stretch>
+                  </pic:blipFill>
+                  <pic:spPr>
+                    <a:xfrm>
+                      <a:off x="0" y="0"/>
+                      <a:ext cx="5401429" cy="2819794"/>
+                    </a:xfrm>
+                    <a:prstGeom prst="rect">
+                      <a:avLst/>
+                    </a:prstGeom>
+                  </pic:spPr>
+                </pic:pic>
+              </a:graphicData>
+            </a:graphic>
+          </wp:inline>
+        </w:drawing>
+      </w:r>
+    </w:p>
+    <w:p>
+      <w:pPr>
+        <w:rPr>
+          <w:rFonts w:ascii="Times New Roman" w:hAnsi="Times New Roman" w:cs="Times New Roman"/>
+          <w:sz w:val="28"/>
+          <w:szCs w:val="28"/>
+          <w:lang w:val="vi-VN"/>
+        </w:rPr>
+      </w:pPr>
+      <w:r>
+        <w:rPr>
+          <w:rFonts w:ascii="Times New Roman" w:hAnsi="Times New Roman" w:cs="Times New Roman"/>
+          <w:sz w:val="28"/>
+          <w:szCs w:val="28"/>
+        </w:rPr>
+        <w:t xml:space="preserve">Câu 104. Truy cập Frontend bằng trình duyệt và hiển thị danh sách sinh viên. (Gợi ý: Truy cập ứng dụng thông qua localhost.) </w:t>
+      </w:r>
+    </w:p>
+    <w:p>
+      <w:pPr>
+        <w:rPr>
+          <w:rFonts w:ascii="Times New Roman" w:hAnsi="Times New Roman" w:cs="Times New Roman"/>
+          <w:sz w:val="28"/>
+          <w:szCs w:val="28"/>
+          <w:lang w:val="vi-VN"/>
+        </w:rPr>
+      </w:pPr>
+      <w:r>
+        <w:rPr>
+          <w:rFonts w:ascii="Times New Roman" w:hAnsi="Times New Roman" w:cs="Times New Roman"/>
+          <w:sz w:val="28"/>
+          <w:szCs w:val="28"/>
+          <w:lang w:val="vi-VN"/>
+        </w:rPr>
+        <w:drawing>
+          <wp:inline distT="0" distB="0" distL="0" distR="0" wp14:anchorId="45D15AE9" wp14:editId="6FE65558">
+            <wp:extent cx="5760720" cy="1755140"/>
+            <wp:effectExtent l="0" t="0" r="0" b="0"/>
+            <wp:docPr id="1667861659" name="Picture 1"/>
+            <wp:cNvGraphicFramePr>
+              <a:graphicFrameLocks xmlns:a="http://schemas.openxmlformats.org/drawingml/2006/main" noChangeAspect="1"/>
+            </wp:cNvGraphicFramePr>
+            <a:graphic xmlns:a="http://schemas.openxmlformats.org/drawingml/2006/main">
+              <a:graphicData uri="http://schemas.openxmlformats.org/drawingml/2006/picture">
+                <pic:pic xmlns:pic="http://schemas.openxmlformats.org/drawingml/2006/picture">
+                  <pic:nvPicPr>
+                    <pic:cNvPr id="1667861659" name=""/>
+                    <pic:cNvPicPr/>
+                  </pic:nvPicPr>
+                  <pic:blipFill>
+                    <a:blip r:embed="rId46"/>
+                    <a:stretch>
+                      <a:fillRect/>
+                    </a:stretch>
+                  </pic:blipFill>
+                  <pic:spPr>
+                    <a:xfrm>
+                      <a:off x="0" y="0"/>
+                      <a:ext cx="5760720" cy="1755140"/>
+                    </a:xfrm>
+                    <a:prstGeom prst="rect">
+                      <a:avLst/>
+                    </a:prstGeom>
+                  </pic:spPr>
+                </pic:pic>
+              </a:graphicData>
+            </a:graphic>
+          </wp:inline>
+        </w:drawing>
+      </w:r>
+    </w:p>
+    <w:p>
+      <w:pPr>
+        <w:rPr>
+          <w:rFonts w:ascii="Times New Roman" w:hAnsi="Times New Roman" w:cs="Times New Roman"/>
+          <w:sz w:val="28"/>
+          <w:szCs w:val="28"/>
+          <w:lang w:val="vi-VN"/>
+        </w:rPr>
+      </w:pPr>
+      <w:r>
+        <w:rPr>
+          <w:rFonts w:ascii="Times New Roman" w:hAnsi="Times New Roman" w:cs="Times New Roman"/>
+          <w:sz w:val="28"/>
+          <w:szCs w:val="28"/>
+        </w:rPr>
+        <w:t xml:space="preserve">Câu 105. Thêm ít nhất 3 sinh viên thông qua giao diện React. (Gợi ý: Sử dụng Form nhập dữ </w:t>
+      </w:r>
+      <w:r>
+        <w:rPr>
+          <w:rFonts w:ascii="Times New Roman" w:hAnsi="Times New Roman" w:cs="Times New Roman"/>
+          <w:sz w:val="28"/>
+          <w:szCs w:val="28"/>
+        </w:rPr>
+        <w:t>l</w:t>
+      </w:r>
+      <w:r>
+        <w:rPr>
+          <w:rFonts w:ascii="Times New Roman" w:hAnsi="Times New Roman" w:cs="Times New Roman"/>
+          <w:sz w:val="28"/>
+          <w:szCs w:val="28"/>
+        </w:rPr>
+        <w:t xml:space="preserve">iệu.) </w:t>
+      </w:r>
+    </w:p>
+    <w:p>
+      <w:pPr>
+        <w:rPr>
+          <w:rFonts w:ascii="Times New Roman" w:hAnsi="Times New Roman" w:cs="Times New Roman"/>
+          <w:sz w:val="28"/>
+          <w:szCs w:val="28"/>
+          <w:lang w:val="vi-VN"/>
+        </w:rPr>
+      </w:pPr>
+      <w:r>
+        <w:rPr>
+          <w:rFonts w:ascii="Times New Roman" w:hAnsi="Times New Roman" w:cs="Times New Roman"/>
+          <w:sz w:val="28"/>
+          <w:szCs w:val="28"/>
+          <w:lang w:val="vi-VN"/>
         </w:rPr>
         <w:lastRenderedPageBreak/>
-        <w:t xml:space="preserve">Câu 103. Kiểm tra trạng thái Backend Container và Frontend Container. (Gợi ý lệnh: docker compose ps) </w:t>
-      </w:r>
-    </w:p>
-    <w:p>
-      <w:pPr>
-        <w:rPr>
-          <w:rFonts w:ascii="Times New Roman" w:hAnsi="Times New Roman" w:cs="Times New Roman"/>
-          <w:sz w:val="28"/>
-          <w:szCs w:val="28"/>
-        </w:rPr>
-      </w:pPr>
-      <w:r>
-        <w:rPr>
-          <w:rFonts w:ascii="Times New Roman" w:hAnsi="Times New Roman" w:cs="Times New Roman"/>
-          <w:sz w:val="28"/>
-          <w:szCs w:val="28"/>
-        </w:rPr>
-        <w:t xml:space="preserve">Câu 104. Truy cập Frontend bằng trình duyệt và hiển thị danh sách sinh viên. (Gợi ý: Truy cập ứng dụng thông qua localhost.) </w:t>
-      </w:r>
-    </w:p>
-    <w:p>
-      <w:pPr>
-        <w:rPr>
-          <w:rFonts w:ascii="Times New Roman" w:hAnsi="Times New Roman" w:cs="Times New Roman"/>
-          <w:sz w:val="28"/>
-          <w:szCs w:val="28"/>
-        </w:rPr>
-      </w:pPr>
-      <w:r>
-        <w:rPr>
-          <w:rFonts w:ascii="Times New Roman" w:hAnsi="Times New Roman" w:cs="Times New Roman"/>
-          <w:sz w:val="28"/>
-          <w:szCs w:val="28"/>
-        </w:rPr>
-        <w:t xml:space="preserve">Câu 105. Thêm ít nhất 3 sinh viên thông qua giao diện React. (Gợi ý: Sử dụng Form nhập dữ </w:t>
-      </w:r>
-      <w:r>
-        <w:rPr>
-          <w:rFonts w:ascii="Times New Roman" w:hAnsi="Times New Roman" w:cs="Times New Roman"/>
-          <w:sz w:val="28"/>
-          <w:szCs w:val="28"/>
-        </w:rPr>
-        <w:t>l</w:t>
-      </w:r>
-      <w:r>
-        <w:rPr>
-          <w:rFonts w:ascii="Times New Roman" w:hAnsi="Times New Roman" w:cs="Times New Roman"/>
-          <w:sz w:val="28"/>
-          <w:szCs w:val="28"/>
-        </w:rPr>
-        <w:t xml:space="preserve">iệu.) </w:t>
-      </w:r>
-    </w:p>
-    <w:p>
-      <w:pPr>
-        <w:rPr>
-          <w:rFonts w:ascii="Times New Roman" w:hAnsi="Times New Roman" w:cs="Times New Roman"/>
-          <w:sz w:val="28"/>
-          <w:szCs w:val="28"/>
+        <w:drawing>
+          <wp:inline distT="0" distB="0" distL="0" distR="0" wp14:anchorId="62FC81C6" wp14:editId="055BFD6D">
+            <wp:extent cx="5760720" cy="2781935"/>
+            <wp:effectExtent l="0" t="0" r="0" b="0"/>
+            <wp:docPr id="414691234" name="Picture 1"/>
+            <wp:cNvGraphicFramePr>
+              <a:graphicFrameLocks xmlns:a="http://schemas.openxmlformats.org/drawingml/2006/main" noChangeAspect="1"/>
+            </wp:cNvGraphicFramePr>
+            <a:graphic xmlns:a="http://schemas.openxmlformats.org/drawingml/2006/main">
+              <a:graphicData uri="http://schemas.openxmlformats.org/drawingml/2006/picture">
+                <pic:pic xmlns:pic="http://schemas.openxmlformats.org/drawingml/2006/picture">
+                  <pic:nvPicPr>
+                    <pic:cNvPr id="414691234" name=""/>
+                    <pic:cNvPicPr/>
+                  </pic:nvPicPr>
+                  <pic:blipFill>
+                    <a:blip r:embed="rId47"/>
+                    <a:stretch>
+                      <a:fillRect/>
+                    </a:stretch>
+                  </pic:blipFill>
+                  <pic:spPr>
+                    <a:xfrm>
+                      <a:off x="0" y="0"/>
+                      <a:ext cx="5760720" cy="2781935"/>
+                    </a:xfrm>
+                    <a:prstGeom prst="rect">
+                      <a:avLst/>
+                    </a:prstGeom>
+                  </pic:spPr>
+                </pic:pic>
+              </a:graphicData>
+            </a:graphic>
+          </wp:inline>
+        </w:drawing>
+      </w:r>
+    </w:p>
+    <w:p>
+      <w:pPr>
+        <w:rPr>
+          <w:rFonts w:ascii="Times New Roman" w:hAnsi="Times New Roman" w:cs="Times New Roman"/>
+          <w:sz w:val="28"/>
+          <w:szCs w:val="28"/>
+          <w:lang w:val="vi-VN"/>
         </w:rPr>
       </w:pPr>
       <w:r>
@@ -1043,6 +3554,59 @@
           <w:rFonts w:ascii="Times New Roman" w:hAnsi="Times New Roman" w:cs="Times New Roman"/>
           <w:sz w:val="28"/>
           <w:szCs w:val="28"/>
+          <w:lang w:val="vi-VN"/>
+        </w:rPr>
+      </w:pPr>
+      <w:r>
+        <w:rPr>
+          <w:rFonts w:ascii="Times New Roman" w:hAnsi="Times New Roman" w:cs="Times New Roman"/>
+          <w:sz w:val="28"/>
+          <w:szCs w:val="28"/>
+          <w:lang w:val="vi-VN"/>
+        </w:rPr>
+        <w:drawing>
+          <wp:inline distT="0" distB="0" distL="0" distR="0" wp14:anchorId="2A188977" wp14:editId="0B38B01F">
+            <wp:extent cx="5760720" cy="2843530"/>
+            <wp:effectExtent l="0" t="0" r="0" b="0"/>
+            <wp:docPr id="1746815974" name="Picture 1"/>
+            <wp:cNvGraphicFramePr>
+              <a:graphicFrameLocks xmlns:a="http://schemas.openxmlformats.org/drawingml/2006/main" noChangeAspect="1"/>
+            </wp:cNvGraphicFramePr>
+            <a:graphic xmlns:a="http://schemas.openxmlformats.org/drawingml/2006/main">
+              <a:graphicData uri="http://schemas.openxmlformats.org/drawingml/2006/picture">
+                <pic:pic xmlns:pic="http://schemas.openxmlformats.org/drawingml/2006/picture">
+                  <pic:nvPicPr>
+                    <pic:cNvPr id="1746815974" name=""/>
+                    <pic:cNvPicPr/>
+                  </pic:nvPicPr>
+                  <pic:blipFill>
+                    <a:blip r:embed="rId48"/>
+                    <a:stretch>
+                      <a:fillRect/>
+                    </a:stretch>
+                  </pic:blipFill>
+                  <pic:spPr>
+                    <a:xfrm>
+                      <a:off x="0" y="0"/>
+                      <a:ext cx="5760720" cy="2843530"/>
+                    </a:xfrm>
+                    <a:prstGeom prst="rect">
+                      <a:avLst/>
+                    </a:prstGeom>
+                  </pic:spPr>
+                </pic:pic>
+              </a:graphicData>
+            </a:graphic>
+          </wp:inline>
+        </w:drawing>
+      </w:r>
+    </w:p>
+    <w:p>
+      <w:pPr>
+        <w:rPr>
+          <w:rFonts w:ascii="Times New Roman" w:hAnsi="Times New Roman" w:cs="Times New Roman"/>
+          <w:sz w:val="28"/>
+          <w:szCs w:val="28"/>
         </w:rPr>
       </w:pPr>
       <w:r>
@@ -1060,14 +3624,69 @@
           <w:rFonts w:ascii="Times New Roman" w:hAnsi="Times New Roman" w:cs="Times New Roman"/>
           <w:sz w:val="28"/>
           <w:szCs w:val="28"/>
-        </w:rPr>
-      </w:pPr>
-      <w:r>
-        <w:rPr>
-          <w:rFonts w:ascii="Times New Roman" w:hAnsi="Times New Roman" w:cs="Times New Roman"/>
-          <w:sz w:val="28"/>
-          <w:szCs w:val="28"/>
-        </w:rPr>
+          <w:lang w:val="vi-VN"/>
+        </w:rPr>
+      </w:pPr>
+      <w:r>
+        <w:rPr>
+          <w:rFonts w:ascii="Times New Roman" w:hAnsi="Times New Roman" w:cs="Times New Roman"/>
+          <w:sz w:val="28"/>
+          <w:szCs w:val="28"/>
+          <w:lang w:val="vi-VN"/>
+        </w:rPr>
+        <w:drawing>
+          <wp:inline distT="0" distB="0" distL="0" distR="0" wp14:anchorId="681BE8D9" wp14:editId="1432FFA1">
+            <wp:extent cx="5760720" cy="1320165"/>
+            <wp:effectExtent l="0" t="0" r="0" b="0"/>
+            <wp:docPr id="1089741026" name="Picture 1"/>
+            <wp:cNvGraphicFramePr>
+              <a:graphicFrameLocks xmlns:a="http://schemas.openxmlformats.org/drawingml/2006/main" noChangeAspect="1"/>
+            </wp:cNvGraphicFramePr>
+            <a:graphic xmlns:a="http://schemas.openxmlformats.org/drawingml/2006/main">
+              <a:graphicData uri="http://schemas.openxmlformats.org/drawingml/2006/picture">
+                <pic:pic xmlns:pic="http://schemas.openxmlformats.org/drawingml/2006/picture">
+                  <pic:nvPicPr>
+                    <pic:cNvPr id="1089741026" name=""/>
+                    <pic:cNvPicPr/>
+                  </pic:nvPicPr>
+                  <pic:blipFill>
+                    <a:blip r:embed="rId49"/>
+                    <a:stretch>
+                      <a:fillRect/>
+                    </a:stretch>
+                  </pic:blipFill>
+                  <pic:spPr>
+                    <a:xfrm>
+                      <a:off x="0" y="0"/>
+                      <a:ext cx="5760720" cy="1320165"/>
+                    </a:xfrm>
+                    <a:prstGeom prst="rect">
+                      <a:avLst/>
+                    </a:prstGeom>
+                  </pic:spPr>
+                </pic:pic>
+              </a:graphicData>
+            </a:graphic>
+          </wp:inline>
+        </w:drawing>
+      </w:r>
+    </w:p>
+    <w:p>
+      <w:pPr>
+        <w:rPr>
+          <w:rFonts w:ascii="Times New Roman" w:hAnsi="Times New Roman" w:cs="Times New Roman"/>
+          <w:sz w:val="28"/>
+          <w:szCs w:val="28"/>
+          <w:lang w:val="vi-VN"/>
+        </w:rPr>
+      </w:pPr>
+      <w:r>
+        <w:rPr>
+          <w:rFonts w:ascii="Times New Roman" w:hAnsi="Times New Roman" w:cs="Times New Roman"/>
+          <w:sz w:val="28"/>
+          <w:szCs w:val="28"/>
+        </w:rPr>
+        <w:lastRenderedPageBreak/>
         <w:t xml:space="preserve">Câu 108. Kiểm tra log Backend Container và xác nhận các Request từ Frontend đã được xử lý. (Gợi ý lệnh: docker compose logs backend) </w:t>
       </w:r>
     </w:p>
@@ -1077,6 +3696,59 @@
           <w:rFonts w:ascii="Times New Roman" w:hAnsi="Times New Roman" w:cs="Times New Roman"/>
           <w:sz w:val="28"/>
           <w:szCs w:val="28"/>
+          <w:lang w:val="vi-VN"/>
+        </w:rPr>
+      </w:pPr>
+      <w:r>
+        <w:rPr>
+          <w:rFonts w:ascii="Times New Roman" w:hAnsi="Times New Roman" w:cs="Times New Roman"/>
+          <w:sz w:val="28"/>
+          <w:szCs w:val="28"/>
+          <w:lang w:val="vi-VN"/>
+        </w:rPr>
+        <w:drawing>
+          <wp:inline distT="0" distB="0" distL="0" distR="0" wp14:anchorId="3AC210FA" wp14:editId="4BDA0FDA">
+            <wp:extent cx="5760720" cy="1582420"/>
+            <wp:effectExtent l="0" t="0" r="0" b="0"/>
+            <wp:docPr id="1832792335" name="Picture 1"/>
+            <wp:cNvGraphicFramePr>
+              <a:graphicFrameLocks xmlns:a="http://schemas.openxmlformats.org/drawingml/2006/main" noChangeAspect="1"/>
+            </wp:cNvGraphicFramePr>
+            <a:graphic xmlns:a="http://schemas.openxmlformats.org/drawingml/2006/main">
+              <a:graphicData uri="http://schemas.openxmlformats.org/drawingml/2006/picture">
+                <pic:pic xmlns:pic="http://schemas.openxmlformats.org/drawingml/2006/picture">
+                  <pic:nvPicPr>
+                    <pic:cNvPr id="1832792335" name=""/>
+                    <pic:cNvPicPr/>
+                  </pic:nvPicPr>
+                  <pic:blipFill>
+                    <a:blip r:embed="rId50"/>
+                    <a:stretch>
+                      <a:fillRect/>
+                    </a:stretch>
+                  </pic:blipFill>
+                  <pic:spPr>
+                    <a:xfrm>
+                      <a:off x="0" y="0"/>
+                      <a:ext cx="5760720" cy="1582420"/>
+                    </a:xfrm>
+                    <a:prstGeom prst="rect">
+                      <a:avLst/>
+                    </a:prstGeom>
+                  </pic:spPr>
+                </pic:pic>
+              </a:graphicData>
+            </a:graphic>
+          </wp:inline>
+        </w:drawing>
+      </w:r>
+    </w:p>
+    <w:p>
+      <w:pPr>
+        <w:rPr>
+          <w:rFonts w:ascii="Times New Roman" w:hAnsi="Times New Roman" w:cs="Times New Roman"/>
+          <w:sz w:val="28"/>
+          <w:szCs w:val="28"/>
         </w:rPr>
       </w:pPr>
       <w:r>
@@ -1111,6 +3783,7 @@
           <w:rFonts w:ascii="Times New Roman" w:hAnsi="Times New Roman" w:cs="Times New Roman"/>
           <w:sz w:val="28"/>
           <w:szCs w:val="28"/>
+          <w:lang w:val="vi-VN"/>
         </w:rPr>
       </w:pPr>
       <w:r>
@@ -1120,6 +3793,113 @@
           <w:szCs w:val="28"/>
         </w:rPr>
         <w:t>compose.yml.)</w:t>
+      </w:r>
+    </w:p>
+    <w:p>
+      <w:pPr>
+        <w:rPr>
+          <w:rFonts w:ascii="Times New Roman" w:hAnsi="Times New Roman" w:cs="Times New Roman"/>
+          <w:sz w:val="28"/>
+          <w:szCs w:val="28"/>
+          <w:lang w:val="vi-VN"/>
+        </w:rPr>
+      </w:pPr>
+      <w:r>
+        <w:rPr>
+          <w:rFonts w:ascii="Times New Roman" w:hAnsi="Times New Roman" w:cs="Times New Roman"/>
+          <w:sz w:val="28"/>
+          <w:szCs w:val="28"/>
+          <w:lang w:val="vi-VN"/>
+        </w:rPr>
+        <w:drawing>
+          <wp:inline distT="0" distB="0" distL="0" distR="0" wp14:anchorId="2987736D" wp14:editId="4A63B70A">
+            <wp:extent cx="5760720" cy="3448685"/>
+            <wp:effectExtent l="0" t="0" r="0" b="0"/>
+            <wp:docPr id="785561084" name="Picture 1"/>
+            <wp:cNvGraphicFramePr>
+              <a:graphicFrameLocks xmlns:a="http://schemas.openxmlformats.org/drawingml/2006/main" noChangeAspect="1"/>
+            </wp:cNvGraphicFramePr>
+            <a:graphic xmlns:a="http://schemas.openxmlformats.org/drawingml/2006/main">
+              <a:graphicData uri="http://schemas.openxmlformats.org/drawingml/2006/picture">
+                <pic:pic xmlns:pic="http://schemas.openxmlformats.org/drawingml/2006/picture">
+                  <pic:nvPicPr>
+                    <pic:cNvPr id="785561084" name=""/>
+                    <pic:cNvPicPr/>
+                  </pic:nvPicPr>
+                  <pic:blipFill>
+                    <a:blip r:embed="rId51"/>
+                    <a:stretch>
+                      <a:fillRect/>
+                    </a:stretch>
+                  </pic:blipFill>
+                  <pic:spPr>
+                    <a:xfrm>
+                      <a:off x="0" y="0"/>
+                      <a:ext cx="5760720" cy="3448685"/>
+                    </a:xfrm>
+                    <a:prstGeom prst="rect">
+                      <a:avLst/>
+                    </a:prstGeom>
+                  </pic:spPr>
+                </pic:pic>
+              </a:graphicData>
+            </a:graphic>
+          </wp:inline>
+        </w:drawing>
+      </w:r>
+    </w:p>
+    <w:p>
+      <w:pPr>
+        <w:rPr>
+          <w:rFonts w:ascii="Times New Roman" w:hAnsi="Times New Roman" w:cs="Times New Roman"/>
+          <w:sz w:val="28"/>
+          <w:szCs w:val="28"/>
+          <w:lang w:val="vi-VN"/>
+        </w:rPr>
+      </w:pPr>
+      <w:r>
+        <w:rPr>
+          <w:rFonts w:ascii="Times New Roman" w:hAnsi="Times New Roman" w:cs="Times New Roman"/>
+          <w:sz w:val="28"/>
+          <w:szCs w:val="28"/>
+          <w:lang w:val="vi-VN"/>
+        </w:rPr>
+        <w:lastRenderedPageBreak/>
+        <w:drawing>
+          <wp:inline distT="0" distB="0" distL="0" distR="0" wp14:anchorId="7AAE4C00" wp14:editId="2E3BE3C0">
+            <wp:extent cx="5760720" cy="2264410"/>
+            <wp:effectExtent l="0" t="0" r="0" b="2540"/>
+            <wp:docPr id="67480191" name="Picture 1"/>
+            <wp:cNvGraphicFramePr>
+              <a:graphicFrameLocks xmlns:a="http://schemas.openxmlformats.org/drawingml/2006/main" noChangeAspect="1"/>
+            </wp:cNvGraphicFramePr>
+            <a:graphic xmlns:a="http://schemas.openxmlformats.org/drawingml/2006/main">
+              <a:graphicData uri="http://schemas.openxmlformats.org/drawingml/2006/picture">
+                <pic:pic xmlns:pic="http://schemas.openxmlformats.org/drawingml/2006/picture">
+                  <pic:nvPicPr>
+                    <pic:cNvPr id="67480191" name=""/>
+                    <pic:cNvPicPr/>
+                  </pic:nvPicPr>
+                  <pic:blipFill>
+                    <a:blip r:embed="rId52"/>
+                    <a:stretch>
+                      <a:fillRect/>
+                    </a:stretch>
+                  </pic:blipFill>
+                  <pic:spPr>
+                    <a:xfrm>
+                      <a:off x="0" y="0"/>
+                      <a:ext cx="5760720" cy="2264410"/>
+                    </a:xfrm>
+                    <a:prstGeom prst="rect">
+                      <a:avLst/>
+                    </a:prstGeom>
+                  </pic:spPr>
+                </pic:pic>
+              </a:graphicData>
+            </a:graphic>
+          </wp:inline>
+        </w:drawing>
       </w:r>
     </w:p>
     <w:sectPr>
@@ -1131,6 +3911,126 @@
     </w:sectPr>
   </w:body>
 </w:document>
+</file>
+
+<file path=word/numbering.xml><?xml version="1.0" encoding="utf-8"?>
+<w:numbering xmlns:wpc="http://schemas.microsoft.com/office/word/2010/wordprocessingCanvas" xmlns:cx="http://schemas.microsoft.com/office/drawing/2014/chartex" xmlns:cx1="http://schemas.microsoft.com/office/drawing/2015/9/8/chartex" xmlns:cx2="http://schemas.microsoft.com/office/drawing/2015/10/21/chartex" xmlns:cx3="http://schemas.microsoft.com/office/drawing/2016/5/9/chartex" xmlns:cx4="http://schemas.microsoft.com/office/drawing/2016/5/10/chartex" xmlns:cx5="http://schemas.microsoft.com/office/drawing/2016/5/11/chartex" xmlns:cx6="http://schemas.microsoft.com/office/drawing/2016/5/12/chartex" xmlns:cx7="http://schemas.microsoft.com/office/drawing/2016/5/13/chartex" xmlns:cx8="http://schemas.microsoft.com/office/drawing/2016/5/14/chartex" xmlns:mc="http://schemas.openxmlformats.org/markup-compatibility/2006" xmlns:aink="http://schemas.microsoft.com/office/drawing/2016/ink" xmlns:am3d="http://schemas.microsoft.com/office/drawing/2017/model3d" xmlns:o="urn:schemas-microsoft-com:office:office" xmlns:oel="http://schemas.microsoft.com/office/2019/extlst" xmlns:r="http://schemas.openxmlformats.org/officeDocument/2006/relationships" xmlns:m="http://schemas.openxmlformats.org/officeDocument/2006/math" xmlns:v="urn:schemas-microsoft-com:vml" xmlns:wp14="http://schemas.microsoft.com/office/word/2010/wordprocessingDrawing" xmlns:wp="http://schemas.openxmlformats.org/drawingml/2006/wordprocessingDrawing" xmlns:w10="urn:schemas-microsoft-com:office:word" xmlns:w="http://schemas.openxmlformats.org/wordprocessingml/2006/main" xmlns:w14="http://schemas.microsoft.com/office/word/2010/wordml" xmlns:w15="http://schemas.microsoft.com/office/word/2012/wordml" xmlns:w16cex="http://schemas.microsoft.com/office/word/2018/wordml/cex" xmlns:w16cid="http://schemas.microsoft.com/office/word/2016/wordml/cid" xmlns:w16="http://schemas.microsoft.com/office/word/2018/wordml" xmlns:w16du="http://schemas.microsoft.com/office/word/2023/wordml/word16du" xmlns:w16sdtdh="http://schemas.microsoft.com/office/word/2020/wordml/sdtdatahash" xmlns:w16sdtfl="http://schemas.microsoft.com/office/word/2024/wordml/sdtformatlock" xmlns:w16se="http://schemas.microsoft.com/office/word/2015/wordml/symex" xmlns:wpg="http://schemas.microsoft.com/office/word/2010/wordprocessingGroup" xmlns:wpi="http://schemas.microsoft.com/office/word/2010/wordprocessingInk" xmlns:wne="http://schemas.microsoft.com/office/word/2006/wordml" xmlns:wps="http://schemas.microsoft.com/office/word/2010/wordprocessingShape" mc:Ignorable="w14 w15 w16se w16cid w16 w16cex w16sdtdh w16sdtfl w16du wp14">
+  <w:abstractNum w:abstractNumId="0" w15:restartNumberingAfterBreak="0">
+    <w:nsid w:val="5FA32D11"/>
+    <w:multiLevelType w:val="hybridMultilevel"/>
+    <w:tmpl w:val="5A980EAE"/>
+    <w:lvl w:ilvl="0" w:tplc="08AADF98">
+      <w:numFmt w:val="bullet"/>
+      <w:lvlText w:val="-"/>
+      <w:lvlJc w:val="left"/>
+      <w:pPr>
+        <w:ind w:left="720" w:hanging="360"/>
+      </w:pPr>
+      <w:rPr>
+        <w:rFonts w:ascii="Times New Roman" w:eastAsiaTheme="minorHAnsi" w:hAnsi="Times New Roman" w:cs="Times New Roman" w:hint="default"/>
+      </w:rPr>
+    </w:lvl>
+    <w:lvl w:ilvl="1" w:tplc="04090003" w:tentative="1">
+      <w:start w:val="1"/>
+      <w:numFmt w:val="bullet"/>
+      <w:lvlText w:val="o"/>
+      <w:lvlJc w:val="left"/>
+      <w:pPr>
+        <w:ind w:left="1440" w:hanging="360"/>
+      </w:pPr>
+      <w:rPr>
+        <w:rFonts w:ascii="Courier New" w:hAnsi="Courier New" w:cs="Courier New" w:hint="default"/>
+      </w:rPr>
+    </w:lvl>
+    <w:lvl w:ilvl="2" w:tplc="04090005" w:tentative="1">
+      <w:start w:val="1"/>
+      <w:numFmt w:val="bullet"/>
+      <w:lvlText w:val=""/>
+      <w:lvlJc w:val="left"/>
+      <w:pPr>
+        <w:ind w:left="2160" w:hanging="360"/>
+      </w:pPr>
+      <w:rPr>
+        <w:rFonts w:ascii="Wingdings" w:hAnsi="Wingdings" w:hint="default"/>
+      </w:rPr>
+    </w:lvl>
+    <w:lvl w:ilvl="3" w:tplc="04090001" w:tentative="1">
+      <w:start w:val="1"/>
+      <w:numFmt w:val="bullet"/>
+      <w:lvlText w:val=""/>
+      <w:lvlJc w:val="left"/>
+      <w:pPr>
+        <w:ind w:left="2880" w:hanging="360"/>
+      </w:pPr>
+      <w:rPr>
+        <w:rFonts w:ascii="Symbol" w:hAnsi="Symbol" w:hint="default"/>
+      </w:rPr>
+    </w:lvl>
+    <w:lvl w:ilvl="4" w:tplc="04090003" w:tentative="1">
+      <w:start w:val="1"/>
+      <w:numFmt w:val="bullet"/>
+      <w:lvlText w:val="o"/>
+      <w:lvlJc w:val="left"/>
+      <w:pPr>
+        <w:ind w:left="3600" w:hanging="360"/>
+      </w:pPr>
+      <w:rPr>
+        <w:rFonts w:ascii="Courier New" w:hAnsi="Courier New" w:cs="Courier New" w:hint="default"/>
+      </w:rPr>
+    </w:lvl>
+    <w:lvl w:ilvl="5" w:tplc="04090005" w:tentative="1">
+      <w:start w:val="1"/>
+      <w:numFmt w:val="bullet"/>
+      <w:lvlText w:val=""/>
+      <w:lvlJc w:val="left"/>
+      <w:pPr>
+        <w:ind w:left="4320" w:hanging="360"/>
+      </w:pPr>
+      <w:rPr>
+        <w:rFonts w:ascii="Wingdings" w:hAnsi="Wingdings" w:hint="default"/>
+      </w:rPr>
+    </w:lvl>
+    <w:lvl w:ilvl="6" w:tplc="04090001" w:tentative="1">
+      <w:start w:val="1"/>
+      <w:numFmt w:val="bullet"/>
+      <w:lvlText w:val=""/>
+      <w:lvlJc w:val="left"/>
+      <w:pPr>
+        <w:ind w:left="5040" w:hanging="360"/>
+      </w:pPr>
+      <w:rPr>
+        <w:rFonts w:ascii="Symbol" w:hAnsi="Symbol" w:hint="default"/>
+      </w:rPr>
+    </w:lvl>
+    <w:lvl w:ilvl="7" w:tplc="04090003" w:tentative="1">
+      <w:start w:val="1"/>
+      <w:numFmt w:val="bullet"/>
+      <w:lvlText w:val="o"/>
+      <w:lvlJc w:val="left"/>
+      <w:pPr>
+        <w:ind w:left="5760" w:hanging="360"/>
+      </w:pPr>
+      <w:rPr>
+        <w:rFonts w:ascii="Courier New" w:hAnsi="Courier New" w:cs="Courier New" w:hint="default"/>
+      </w:rPr>
+    </w:lvl>
+    <w:lvl w:ilvl="8" w:tplc="04090005" w:tentative="1">
+      <w:start w:val="1"/>
+      <w:numFmt w:val="bullet"/>
+      <w:lvlText w:val=""/>
+      <w:lvlJc w:val="left"/>
+      <w:pPr>
+        <w:ind w:left="6480" w:hanging="360"/>
+      </w:pPr>
+      <w:rPr>
+        <w:rFonts w:ascii="Wingdings" w:hAnsi="Wingdings" w:hint="default"/>
+      </w:rPr>
+    </w:lvl>
+  </w:abstractNum>
+  <w:num w:numId="1" w16cid:durableId="275991129">
+    <w:abstractNumId w:val="0"/>
+  </w:num>
+</w:numbering>
 </file>
 
 <file path=word/styles.xml><?xml version="1.0" encoding="utf-8"?>
@@ -1736,7 +4636,6 @@
   <w:style w:type="character" w:default="1" w:styleId="DefaultParagraphFont">
     <w:name w:val="Default Paragraph Font"/>
     <w:uiPriority w:val="1"/>
-    <w:semiHidden/>
     <w:unhideWhenUsed/>
   </w:style>
   <w:style w:type="table" w:default="1" w:styleId="TableNormal">

</xml_diff>